<commit_message>
Preparar repositorio para entrega del informe TFG.
Regenera figuras y Word de la memoria, actualiza conteo de tests (258) y checklist de entrega, e ignora Juego/Data/ del .exe.

Co-authored-by: Cursor <cursoragent@cursor.com>
</commit_message>
<xml_diff>
--- a/Docs/Entrega/Memoria_TFG_latex.docx
+++ b/Docs/Entrega/Memoria_TFG_latex.docx
@@ -3437,13 +3437,13 @@
                 <w:b/>
                 <w:bCs/>
               </w:rPr>
-              <w:t xml:space="preserve">246</w:t>
+              <w:t xml:space="preserve">258</w:t>
             </w:r>
             <w:r>
               <w:t xml:space="preserve"> </w:t>
             </w:r>
             <w:r>
-              <w:t xml:space="preserve">tests: 238 + 8 en</w:t>
+              <w:t xml:space="preserve">tests: 250 + 8 en</w:t>
             </w:r>
             <w:r>
               <w:t xml:space="preserve"> </w:t>
@@ -5306,7 +5306,7 @@
           <w:b/>
           <w:bCs/>
         </w:rPr>
-        <w:t xml:space="preserve">246</w:t>
+        <w:t xml:space="preserve">258</w:t>
       </w:r>
       <w:r>
         <w:t xml:space="preserve"> </w:t>
@@ -5541,7 +5541,7 @@
               <w:jc w:val="left"/>
             </w:pPr>
             <w:r>
-              <w:t xml:space="preserve">246</w:t>
+              <w:t xml:space="preserve">258</w:t>
             </w:r>
           </w:p>
         </w:tc>
@@ -7098,7 +7098,7 @@
       <w:r>
         <w:drawing>
           <wp:inline>
-            <wp:extent cx="3810000" cy="2540000"/>
+            <wp:extent cx="5227320" cy="2080227"/>
             <wp:effectExtent b="0" l="0" r="0" t="0"/>
             <wp:docPr descr="" title="" id="48" name="Picture"/>
             <a:graphic>
@@ -7119,7 +7119,7 @@
                   <pic:spPr bwMode="auto">
                     <a:xfrm>
                       <a:off x="0" y="0"/>
-                      <a:ext cx="3810000" cy="2540000"/>
+                      <a:ext cx="5227320" cy="2080227"/>
                     </a:xfrm>
                     <a:prstGeom prst="rect">
                       <a:avLst/>
@@ -8352,7 +8352,7 @@
               <w:jc w:val="left"/>
             </w:pPr>
             <w:r>
-              <w:t xml:space="preserve">Banco validado, 246 tests + CI; sin estudio con usuarios</w:t>
+              <w:t xml:space="preserve">Banco validado, 258 tests + CI; sin estudio con usuarios</w:t>
             </w:r>
           </w:p>
         </w:tc>

</xml_diff>

<commit_message>
Unificar modo historia (v27), mínimo 5 preguntas y pipeline de entrega.
Catálogo de 5 presets (repaso, simulacro, examen por materia con n_preguntas dinámico), límites globales, UI con saltos numéricos y textos «tipo de preguntas». Elimina código obsoleto, amplía tests (303) y actualiza memoria, utilidades_tfg y juego_grafico.exe.

Co-authored-by: Cursor <cursoragent@cursor.com>
</commit_message>
<xml_diff>
--- a/Docs/Entrega/Memoria_TFG_latex.docx
+++ b/Docs/Entrega/Memoria_TFG_latex.docx
@@ -256,20 +256,74 @@
         <w:t xml:space="preserve">. El PDF de entrega lo exportas desde Word tras editar.</w:t>
       </w:r>
     </w:p>
-    <w:bookmarkStart w:id="20" w:name="introducción"/>
+    <w:p xmlns:w="http://schemas.openxmlformats.org/wordprocessingml/2006/main">
+      <w:r>
+        <w:br w:type="page"/>
+      </w:r>
+    </w:p>
+    <w:sdt>
+      <w:sdtPr>
+        <w:docPartObj>
+          <w:docPartGallery w:val="Table of Contents"/>
+          <w:docPartUnique/>
+        </w:docPartObj>
+      </w:sdtPr>
+      <w:sdtContent>
+        <w:p>
+          <w:pPr>
+            <w:pStyle w:val="TOCHeading"/>
+          </w:pPr>
+          <w:r>
+            <w:t xml:space="preserve">Índice</w:t>
+          </w:r>
+        </w:p>
+        <w:p>
+          <w:r>
+            <w:fldChar w:fldCharType="begin" w:dirty="true"/>
+            <w:instrText xml:space="preserve">TOC \o "1-2" \h \z \u</w:instrText>
+            <w:fldChar w:fldCharType="separate"/>
+            <w:fldChar w:fldCharType="end"/>
+          </w:r>
+        </w:p>
+      </w:sdtContent>
+    </w:sdt>
+    <w:p xmlns:w="http://schemas.openxmlformats.org/wordprocessingml/2006/main">
+      <w:r>
+        <w:br w:type="page"/>
+      </w:r>
+    </w:p>
+    <w:bookmarkStart w:id="51" w:name="introducción"/>
     <w:p>
       <w:pPr>
         <w:pStyle w:val="Heading1"/>
       </w:pPr>
       <w:r>
+        <w:rPr>
+          <w:rStyle w:val="SectionNumber"/>
+        </w:rPr>
+        <w:t xml:space="preserve">1</w:t>
+      </w:r>
+      <w:r>
+        <w:tab/>
+      </w:r>
+      <w:r>
         <w:t xml:space="preserve">Introducción</w:t>
       </w:r>
     </w:p>
-    <w:bookmarkStart w:id="9" w:name="contexto"/>
+    <w:bookmarkStart w:id="40" w:name="contexto"/>
     <w:p>
       <w:pPr>
         <w:pStyle w:val="Heading2"/>
       </w:pPr>
+      <w:r>
+        <w:rPr>
+          <w:rStyle w:val="SectionNumber"/>
+        </w:rPr>
+        <w:t xml:space="preserve">1.1</w:t>
+      </w:r>
+      <w:r>
+        <w:tab/>
+      </w:r>
       <w:r>
         <w:t xml:space="preserve">Contexto</w:t>
       </w:r>
@@ -354,12 +408,21 @@
         <w:t xml:space="preserve">—secuencia de escenas o salas que contextualizan los retos— envuelve desafíos cognitivos; sin embargo, su desarrollo completo exige un esfuerzo considerable en diseño gráfico, guion y validación pedagógica.</w:t>
       </w:r>
     </w:p>
-    <w:bookmarkEnd w:id="9"/>
-    <w:bookmarkStart w:id="10" w:name="motivación"/>
+    <w:bookmarkEnd w:id="40"/>
+    <w:bookmarkStart w:id="41" w:name="motivación"/>
     <w:p>
       <w:pPr>
         <w:pStyle w:val="Heading2"/>
       </w:pPr>
+      <w:r>
+        <w:rPr>
+          <w:rStyle w:val="SectionNumber"/>
+        </w:rPr>
+        <w:t xml:space="preserve">1.2</w:t>
+      </w:r>
+      <w:r>
+        <w:tab/>
+      </w:r>
       <w:r>
         <w:t xml:space="preserve">Motivación</w:t>
       </w:r>
@@ -512,12 +575,21 @@
         <w:t xml:space="preserve">La motivación principal es combinar programación, matemáticas y diseño interactivo en una aplicación práctica que consolide conocimientos del grado y que pueda ser extendida por el propio autor o por el profesorado.</w:t>
       </w:r>
     </w:p>
-    <w:bookmarkEnd w:id="10"/>
-    <w:bookmarkStart w:id="11" w:name="alcance-del-entregable"/>
+    <w:bookmarkEnd w:id="41"/>
+    <w:bookmarkStart w:id="42" w:name="alcance-del-entregable"/>
     <w:p>
       <w:pPr>
         <w:pStyle w:val="Heading2"/>
       </w:pPr>
+      <w:r>
+        <w:rPr>
+          <w:rStyle w:val="SectionNumber"/>
+        </w:rPr>
+        <w:t xml:space="preserve">1.3</w:t>
+      </w:r>
+      <w:r>
+        <w:tab/>
+      </w:r>
       <w:r>
         <w:t xml:space="preserve">Alcance del entregable</w:t>
       </w:r>
@@ -587,12 +659,21 @@
         <w:t xml:space="preserve">).</w:t>
       </w:r>
     </w:p>
-    <w:bookmarkEnd w:id="11"/>
-    <w:bookmarkStart w:id="12" w:name="objetivos-derivados-del-desarrollo"/>
+    <w:bookmarkEnd w:id="42"/>
+    <w:bookmarkStart w:id="43" w:name="objetivos-derivados-del-desarrollo"/>
     <w:p>
       <w:pPr>
         <w:pStyle w:val="Heading2"/>
       </w:pPr>
+      <w:r>
+        <w:rPr>
+          <w:rStyle w:val="SectionNumber"/>
+        </w:rPr>
+        <w:t xml:space="preserve">1.4</w:t>
+      </w:r>
+      <w:r>
+        <w:tab/>
+      </w:r>
       <w:r>
         <w:t xml:space="preserve">Objetivos derivados del desarrollo</w:t>
       </w:r>
@@ -678,21 +759,39 @@
         <w:t xml:space="preserve">).</w:t>
       </w:r>
     </w:p>
-    <w:bookmarkEnd w:id="12"/>
-    <w:bookmarkStart w:id="19" w:name="marco-teórico-y-estado-del-arte"/>
+    <w:bookmarkEnd w:id="43"/>
+    <w:bookmarkStart w:id="50" w:name="marco-teórico-y-estado-del-arte"/>
     <w:p>
       <w:pPr>
         <w:pStyle w:val="Heading2"/>
       </w:pPr>
       <w:r>
+        <w:rPr>
+          <w:rStyle w:val="SectionNumber"/>
+        </w:rPr>
+        <w:t xml:space="preserve">1.5</w:t>
+      </w:r>
+      <w:r>
+        <w:tab/>
+      </w:r>
+      <w:r>
         <w:t xml:space="preserve">Marco teórico y estado del arte</w:t>
       </w:r>
     </w:p>
-    <w:bookmarkStart w:id="13" w:name="X6eb52f069087824c7d3eb7ecc2b46d123991812"/>
+    <w:bookmarkStart w:id="44" w:name="X6eb52f069087824c7d3eb7ecc2b46d123991812"/>
     <w:p>
       <w:pPr>
         <w:pStyle w:val="Heading3"/>
       </w:pPr>
+      <w:r>
+        <w:rPr>
+          <w:rStyle w:val="SectionNumber"/>
+        </w:rPr>
+        <w:t xml:space="preserve">1.5.1</w:t>
+      </w:r>
+      <w:r>
+        <w:tab/>
+      </w:r>
       <w:r>
         <w:t xml:space="preserve">Aprendizaje activo y evaluación formativa</w:t>
       </w:r>
@@ -729,12 +828,21 @@
         <w:t xml:space="preserve">Los cuestionarios de opción múltiple, cuando están bien diseñados, permiten cubrir un espectro amplio de contenidos con corrección automática. Su efectividad depende de la calidad del ítem: enunciados claros, distractores plausibles y alineación con los resultados de aprendizaje (Haladyna et al., 2002).</w:t>
       </w:r>
     </w:p>
-    <w:bookmarkEnd w:id="13"/>
-    <w:bookmarkStart w:id="14" w:name="Xe84cf04b537bf3bd5e2051d64d0ffba57fcf36b"/>
+    <w:bookmarkEnd w:id="44"/>
+    <w:bookmarkStart w:id="45" w:name="Xe84cf04b537bf3bd5e2051d64d0ffba57fcf36b"/>
     <w:p>
       <w:pPr>
         <w:pStyle w:val="Heading3"/>
       </w:pPr>
+      <w:r>
+        <w:rPr>
+          <w:rStyle w:val="SectionNumber"/>
+        </w:rPr>
+        <w:t xml:space="preserve">1.5.2</w:t>
+      </w:r>
+      <w:r>
+        <w:tab/>
+      </w:r>
       <w:r>
         <w:t xml:space="preserve">Gamificación y aprendizaje basado en juegos</w:t>
       </w:r>
@@ -805,12 +913,21 @@
         <w:t xml:space="preserve">(Michael y Chen, 2005) han mostrado potencial para reforzar conceptos abstractos, con evidencia dependiente del dominio (Kiili, 2005).</w:t>
       </w:r>
     </w:p>
-    <w:bookmarkEnd w:id="14"/>
-    <w:bookmarkStart w:id="15" w:name="serious-games-escape-rooms-y-narrativa"/>
+    <w:bookmarkEnd w:id="45"/>
+    <w:bookmarkStart w:id="46" w:name="serious-games-escape-rooms-y-narrativa"/>
     <w:p>
       <w:pPr>
         <w:pStyle w:val="Heading3"/>
       </w:pPr>
+      <w:r>
+        <w:rPr>
+          <w:rStyle w:val="SectionNumber"/>
+        </w:rPr>
+        <w:t xml:space="preserve">1.5.3</w:t>
+      </w:r>
+      <w:r>
+        <w:tab/>
+      </w:r>
       <w:r>
         <w:t xml:space="preserve">Serious games, escape rooms y narrativa</w:t>
       </w:r>
@@ -855,13 +972,22 @@
         <w:t xml:space="preserve">envolvente (Veldkamp et al., 2020); si no está alineada con los objetivos de aprendizaje, puede distraer (Habgood y Ainsworth, 2011). Este TFG separa la capa evaluable (banco + motor) de la narrativa gráfica pendiente.</w:t>
       </w:r>
     </w:p>
-    <w:bookmarkEnd w:id="15"/>
-    <w:bookmarkStart w:id="16" w:name="Xbd8bf8877c345ed30bc9633b1a8df7645d431f5"/>
+    <w:bookmarkEnd w:id="46"/>
+    <w:bookmarkStart w:id="47" w:name="Xbd8bf8877c345ed30bc9633b1a8df7645d431f5"/>
     <w:p>
       <w:pPr>
         <w:pStyle w:val="Heading3"/>
       </w:pPr>
       <w:r>
+        <w:rPr>
+          <w:rStyle w:val="SectionNumber"/>
+        </w:rPr>
+        <w:t xml:space="preserve">1.5.4</w:t>
+      </w:r>
+      <w:r>
+        <w:tab/>
+      </w:r>
+      <w:r>
         <w:t xml:space="preserve">Bancos de preguntas y tutoría inteligente</w:t>
       </w:r>
     </w:p>
@@ -873,12 +999,21 @@
         <w:t xml:space="preserve">Plataformas como Moodle integran cuestionarios con categorías; los sistemas adaptativos seleccionan ítems según prerrequisitos (Brusilovsky y Peylo, 2003). Este proyecto anticipa esa línea con metadatos curriculares y el modo historia ponderado por calificaciones históricas.</w:t>
       </w:r>
     </w:p>
-    <w:bookmarkEnd w:id="16"/>
-    <w:bookmarkStart w:id="17" w:name="posicionamiento"/>
+    <w:bookmarkEnd w:id="47"/>
+    <w:bookmarkStart w:id="48" w:name="posicionamiento"/>
     <w:p>
       <w:pPr>
         <w:pStyle w:val="Heading3"/>
       </w:pPr>
+      <w:r>
+        <w:rPr>
+          <w:rStyle w:val="SectionNumber"/>
+        </w:rPr>
+        <w:t xml:space="preserve">1.5.5</w:t>
+      </w:r>
+      <w:r>
+        <w:tab/>
+      </w:r>
       <w:r>
         <w:t xml:space="preserve">Posicionamiento</w:t>
       </w:r>
@@ -907,12 +1042,21 @@
         <w:t xml:space="preserve">con metadatos curriculares explícitos y código mantenible. La contribución distintiva es triple: alineación curricular (40 materias, 4×2×5), trazabilidad de calidad del banco y arquitectura extensible.</w:t>
       </w:r>
     </w:p>
-    <w:bookmarkEnd w:id="17"/>
-    <w:bookmarkStart w:id="18" w:name="ítems-distractores-fuertes-y-débiles"/>
+    <w:bookmarkEnd w:id="48"/>
+    <w:bookmarkStart w:id="49" w:name="ítems-distractores-fuertes-y-débiles"/>
     <w:p>
       <w:pPr>
         <w:pStyle w:val="Heading3"/>
       </w:pPr>
+      <w:r>
+        <w:rPr>
+          <w:rStyle w:val="SectionNumber"/>
+        </w:rPr>
+        <w:t xml:space="preserve">1.5.6</w:t>
+      </w:r>
+      <w:r>
+        <w:tab/>
+      </w:r>
       <w:r>
         <w:t xml:space="preserve">Ítems, distractores fuertes y débiles</w:t>
       </w:r>
@@ -970,24 +1114,42 @@
         <w:t xml:space="preserve">delata el ítem (opciones genéricas, longitudes desiguales, etc.). La auditoría automatizada detecta patrones débiles; la revisión manual valora la plausibilidad pedagógica.</w:t>
       </w:r>
     </w:p>
-    <w:bookmarkEnd w:id="18"/>
-    <w:bookmarkEnd w:id="19"/>
-    <w:bookmarkEnd w:id="20"/>
-    <w:bookmarkStart w:id="23" w:name="objetivos"/>
+    <w:bookmarkEnd w:id="49"/>
+    <w:bookmarkEnd w:id="50"/>
+    <w:bookmarkEnd w:id="51"/>
+    <w:bookmarkStart w:id="54" w:name="objetivos"/>
     <w:p>
       <w:pPr>
         <w:pStyle w:val="Heading1"/>
       </w:pPr>
       <w:r>
+        <w:rPr>
+          <w:rStyle w:val="SectionNumber"/>
+        </w:rPr>
+        <w:t xml:space="preserve">2</w:t>
+      </w:r>
+      <w:r>
+        <w:tab/>
+      </w:r>
+      <w:r>
         <w:t xml:space="preserve">Objetivos</w:t>
       </w:r>
     </w:p>
-    <w:bookmarkStart w:id="21" w:name="objetivo-general"/>
+    <w:bookmarkStart w:id="52" w:name="objetivo-general"/>
     <w:p>
       <w:pPr>
         <w:pStyle w:val="Heading2"/>
       </w:pPr>
       <w:r>
+        <w:rPr>
+          <w:rStyle w:val="SectionNumber"/>
+        </w:rPr>
+        <w:t xml:space="preserve">2.1</w:t>
+      </w:r>
+      <w:r>
+        <w:tab/>
+      </w:r>
+      <w:r>
         <w:t xml:space="preserve">Objetivo general</w:t>
       </w:r>
     </w:p>
@@ -999,12 +1161,21 @@
         <w:t xml:space="preserve">Diseñar e implementar un juego interactivo educativo en el que la progresión del jugador dependa de la resolución de retos basados en contenidos del grado en Matemática Computacional y Análisis de Datos.</w:t>
       </w:r>
     </w:p>
-    <w:bookmarkEnd w:id="21"/>
-    <w:bookmarkStart w:id="22" w:name="objetivos-específicos"/>
+    <w:bookmarkEnd w:id="52"/>
+    <w:bookmarkStart w:id="53" w:name="objetivos-específicos"/>
     <w:p>
       <w:pPr>
         <w:pStyle w:val="Heading2"/>
       </w:pPr>
+      <w:r>
+        <w:rPr>
+          <w:rStyle w:val="SectionNumber"/>
+        </w:rPr>
+        <w:t xml:space="preserve">2.2</w:t>
+      </w:r>
+      <w:r>
+        <w:tab/>
+      </w:r>
       <w:r>
         <w:t xml:space="preserve">Objetivos específicos</w:t>
       </w:r>
@@ -1272,13 +1443,22 @@
         <w:t xml:space="preserve">El grado de cumplimiento de cada objetivo se discute en la sección 6.</w:t>
       </w:r>
     </w:p>
-    <w:bookmarkEnd w:id="22"/>
-    <w:bookmarkEnd w:id="23"/>
-    <w:bookmarkStart w:id="24" w:name="hipótesis-de-trabajo"/>
+    <w:bookmarkEnd w:id="53"/>
+    <w:bookmarkEnd w:id="54"/>
+    <w:bookmarkStart w:id="55" w:name="hipótesis-de-trabajo"/>
     <w:p>
       <w:pPr>
         <w:pStyle w:val="Heading1"/>
       </w:pPr>
+      <w:r>
+        <w:rPr>
+          <w:rStyle w:val="SectionNumber"/>
+        </w:rPr>
+        <w:t xml:space="preserve">3</w:t>
+      </w:r>
+      <w:r>
+        <w:tab/>
+      </w:r>
       <w:r>
         <w:t xml:space="preserve">Hipótesis de trabajo</w:t>
       </w:r>
@@ -1485,21 +1665,39 @@
         <w:t xml:space="preserve">(gamificación vs. listado estático) no se incluye por falta de indicadores de usuario en este TFG; se traslada a trabajo futuro (§6.6 y §7).</w:t>
       </w:r>
     </w:p>
-    <w:bookmarkEnd w:id="24"/>
-    <w:bookmarkStart w:id="34" w:name="metodología"/>
+    <w:bookmarkEnd w:id="55"/>
+    <w:bookmarkStart w:id="65" w:name="metodología"/>
     <w:p>
       <w:pPr>
         <w:pStyle w:val="Heading1"/>
       </w:pPr>
       <w:r>
+        <w:rPr>
+          <w:rStyle w:val="SectionNumber"/>
+        </w:rPr>
+        <w:t xml:space="preserve">4</w:t>
+      </w:r>
+      <w:r>
+        <w:tab/>
+      </w:r>
+      <w:r>
         <w:t xml:space="preserve">Metodología</w:t>
       </w:r>
     </w:p>
-    <w:bookmarkStart w:id="25" w:name="enfoque-general"/>
+    <w:bookmarkStart w:id="56" w:name="enfoque-general"/>
     <w:p>
       <w:pPr>
         <w:pStyle w:val="Heading2"/>
       </w:pPr>
+      <w:r>
+        <w:rPr>
+          <w:rStyle w:val="SectionNumber"/>
+        </w:rPr>
+        <w:t xml:space="preserve">4.1</w:t>
+      </w:r>
+      <w:r>
+        <w:tab/>
+      </w:r>
       <w:r>
         <w:t xml:space="preserve">Enfoque general</w:t>
       </w:r>
@@ -1620,12 +1818,21 @@
         <w:t xml:space="preserve">El control de versiones con Git permitió iterar sobre el banco y el código de forma trazable. El repositorio público facilita la reproducibilidad del trabajo.</w:t>
       </w:r>
     </w:p>
-    <w:bookmarkEnd w:id="25"/>
-    <w:bookmarkStart w:id="26" w:name="diseño-del-banco-de-preguntas"/>
+    <w:bookmarkEnd w:id="56"/>
+    <w:bookmarkStart w:id="57" w:name="diseño-del-banco-de-preguntas"/>
     <w:p>
       <w:pPr>
         <w:pStyle w:val="Heading2"/>
       </w:pPr>
+      <w:r>
+        <w:rPr>
+          <w:rStyle w:val="SectionNumber"/>
+        </w:rPr>
+        <w:t xml:space="preserve">4.2</w:t>
+      </w:r>
+      <w:r>
+        <w:tab/>
+      </w:r>
       <w:r>
         <w:t xml:space="preserve">Diseño del banco de preguntas</w:t>
       </w:r>
@@ -2082,12 +2289,21 @@
         <w:t xml:space="preserve">.</w:t>
       </w:r>
     </w:p>
-    <w:bookmarkEnd w:id="26"/>
-    <w:bookmarkStart w:id="31" w:name="diseño-e-implementación-del-software"/>
+    <w:bookmarkEnd w:id="57"/>
+    <w:bookmarkStart w:id="62" w:name="diseño-e-implementación-del-software"/>
     <w:p>
       <w:pPr>
         <w:pStyle w:val="Heading2"/>
       </w:pPr>
+      <w:r>
+        <w:rPr>
+          <w:rStyle w:val="SectionNumber"/>
+        </w:rPr>
+        <w:t xml:space="preserve">4.3</w:t>
+      </w:r>
+      <w:r>
+        <w:tab/>
+      </w:r>
       <w:r>
         <w:t xml:space="preserve">Diseño e implementación del software</w:t>
       </w:r>
@@ -2237,7 +2453,7 @@
         <w:t xml:space="preserve">): el lanzador orquesta los modos de juego; cada modo delega en el motor de partida la corrección, la puntuación y los informes; la capa de datos abstrae el acceso al banco cerrado y a los metadatos curriculares. Los scripts de mantenimiento operan sobre los mismos ficheros sin formar parte del ejecutable del juego.</w:t>
       </w:r>
     </w:p>
-    <w:bookmarkStart w:id="30" w:name="fig:arquitectura"/>
+    <w:bookmarkStart w:id="61" w:name="fig:arquitectura"/>
     <w:p>
       <w:pPr>
         <w:pStyle w:val="CaptionedFigure"/>
@@ -2247,18 +2463,18 @@
           <wp:inline>
             <wp:extent cx="4907280" cy="3084698"/>
             <wp:effectExtent b="0" l="0" r="0" t="0"/>
-            <wp:docPr descr="" title="" id="28" name="Picture"/>
+            <wp:docPr descr="" title="" id="59" name="Picture"/>
             <a:graphic>
               <a:graphicData uri="http://schemas.openxmlformats.org/drawingml/2006/picture">
                 <pic:pic>
                   <pic:nvPicPr>
-                    <pic:cNvPr descr="arquitectura_sistema.png" id="29" name="Picture"/>
+                    <pic:cNvPr descr="arquitectura_sistema.png" id="60" name="Picture"/>
                     <pic:cNvPicPr>
                       <a:picLocks noChangeArrowheads="1" noChangeAspect="1"/>
                     </pic:cNvPicPr>
                   </pic:nvPicPr>
                   <pic:blipFill>
-                    <a:blip r:embed="rId27"/>
+                    <a:blip r:embed="rId58"/>
                     <a:stretch>
                       <a:fillRect/>
                     </a:stretch>
@@ -2293,7 +2509,7 @@
         <w:t xml:space="preserve">Arquitectura en capas del cuestionario MATCAD (módulos principales y flujo de dependencias).</w:t>
       </w:r>
     </w:p>
-    <w:bookmarkEnd w:id="30"/>
+    <w:bookmarkEnd w:id="61"/>
     <w:tbl>
       <w:tblPr>
         <w:tblStyle w:val="Table"/>
@@ -3203,12 +3419,21 @@
         </w:tc>
       </w:tr>
     </w:tbl>
-    <w:bookmarkEnd w:id="31"/>
-    <w:bookmarkStart w:id="32" w:name="validación-y-aseguramiento-de-la-calidad"/>
+    <w:bookmarkEnd w:id="62"/>
+    <w:bookmarkStart w:id="63" w:name="validación-y-aseguramiento-de-la-calidad"/>
     <w:p>
       <w:pPr>
         <w:pStyle w:val="Heading2"/>
       </w:pPr>
+      <w:r>
+        <w:rPr>
+          <w:rStyle w:val="SectionNumber"/>
+        </w:rPr>
+        <w:t xml:space="preserve">4.4</w:t>
+      </w:r>
+      <w:r>
+        <w:tab/>
+      </w:r>
       <w:r>
         <w:t xml:space="preserve">Validación y aseguramiento de la calidad</w:t>
       </w:r>
@@ -3530,7 +3755,7 @@
               <w:jc w:val="left"/>
             </w:pPr>
             <w:r>
-              <w:t xml:space="preserve">Simulación Monte Carlo (respuestas al azar)</w:t>
+              <w:t xml:space="preserve">Simulación Monte Carlo</w:t>
             </w:r>
           </w:p>
         </w:tc>
@@ -3605,12 +3830,21 @@
         <w:t xml:space="preserve">para evitar modificaciones accidentales.</w:t>
       </w:r>
     </w:p>
-    <w:bookmarkEnd w:id="32"/>
-    <w:bookmarkStart w:id="33" w:name="criterios-de-éxito"/>
+    <w:bookmarkEnd w:id="63"/>
+    <w:bookmarkStart w:id="64" w:name="criterios-de-éxito"/>
     <w:p>
       <w:pPr>
         <w:pStyle w:val="Heading2"/>
       </w:pPr>
+      <w:r>
+        <w:rPr>
+          <w:rStyle w:val="SectionNumber"/>
+        </w:rPr>
+        <w:t xml:space="preserve">4.5</w:t>
+      </w:r>
+      <w:r>
+        <w:tab/>
+      </w:r>
       <w:r>
         <w:t xml:space="preserve">Criterios de éxito</w:t>
       </w:r>
@@ -3676,22 +3910,40 @@
         <w:t xml:space="preserve">El contenido había pasado revisión manual completa.</w:t>
       </w:r>
     </w:p>
-    <w:bookmarkEnd w:id="33"/>
-    <w:bookmarkEnd w:id="34"/>
-    <w:bookmarkStart w:id="56" w:name="resultados"/>
+    <w:bookmarkEnd w:id="64"/>
+    <w:bookmarkEnd w:id="65"/>
+    <w:bookmarkStart w:id="87" w:name="resultados"/>
     <w:p>
       <w:pPr>
         <w:pStyle w:val="Heading1"/>
       </w:pPr>
       <w:r>
+        <w:rPr>
+          <w:rStyle w:val="SectionNumber"/>
+        </w:rPr>
+        <w:t xml:space="preserve">5</w:t>
+      </w:r>
+      <w:r>
+        <w:tab/>
+      </w:r>
+      <w:r>
         <w:t xml:space="preserve">Resultados</w:t>
       </w:r>
     </w:p>
-    <w:bookmarkStart w:id="35" w:name="banco-de-preguntas"/>
+    <w:bookmarkStart w:id="66" w:name="banco-de-preguntas"/>
     <w:p>
       <w:pPr>
         <w:pStyle w:val="Heading2"/>
       </w:pPr>
+      <w:r>
+        <w:rPr>
+          <w:rStyle w:val="SectionNumber"/>
+        </w:rPr>
+        <w:t xml:space="preserve">5.1</w:t>
+      </w:r>
+      <w:r>
+        <w:tab/>
+      </w:r>
       <w:r>
         <w:t xml:space="preserve">Banco de preguntas</w:t>
       </w:r>
@@ -3897,12 +4149,21 @@
         <w:t xml:space="preserve">(pool ampliado con plantillas no revisadas, hasta 1440 ítems jugables), dejando clara la trazabilidad para evaluación formal del TFG.</w:t>
       </w:r>
     </w:p>
-    <w:bookmarkEnd w:id="35"/>
-    <w:bookmarkStart w:id="36" w:name="aplicación-de-juego"/>
+    <w:bookmarkEnd w:id="66"/>
+    <w:bookmarkStart w:id="67" w:name="aplicación-de-juego"/>
     <w:p>
       <w:pPr>
         <w:pStyle w:val="Heading2"/>
       </w:pPr>
+      <w:r>
+        <w:rPr>
+          <w:rStyle w:val="SectionNumber"/>
+        </w:rPr>
+        <w:t xml:space="preserve">5.2</w:t>
+      </w:r>
+      <w:r>
+        <w:tab/>
+      </w:r>
       <w:r>
         <w:t xml:space="preserve">Aplicación de juego</w:t>
       </w:r>
@@ -4332,12 +4593,21 @@
         </w:tc>
       </w:tr>
     </w:tbl>
-    <w:bookmarkEnd w:id="36"/>
-    <w:bookmarkStart w:id="39" w:name="organización-curricular-modelada"/>
+    <w:bookmarkEnd w:id="67"/>
+    <w:bookmarkStart w:id="70" w:name="organización-curricular-modelada"/>
     <w:p>
       <w:pPr>
         <w:pStyle w:val="Heading2"/>
       </w:pPr>
+      <w:r>
+        <w:rPr>
+          <w:rStyle w:val="SectionNumber"/>
+        </w:rPr>
+        <w:t xml:space="preserve">5.3</w:t>
+      </w:r>
+      <w:r>
+        <w:tab/>
+      </w:r>
       <w:r>
         <w:t xml:space="preserve">Organización curricular modelada</w:t>
       </w:r>
@@ -4610,8 +4880,8 @@
       <w:pPr>
         <w:pStyle w:val="BodyText"/>
       </w:pPr>
-      <w:bookmarkStart w:id="37" w:name="tab:curso-sem"/>
-      <w:bookmarkEnd w:id="37"/>
+      <w:bookmarkStart w:id="68" w:name="tab:curso-sem"/>
+      <w:bookmarkEnd w:id="68"/>
     </w:p>
     <w:p>
       <w:pPr>
@@ -5097,8 +5367,8 @@
       <w:pPr>
         <w:pStyle w:val="BodyText"/>
       </w:pPr>
-      <w:bookmarkStart w:id="38" w:name="tab:grupos"/>
-      <w:bookmarkEnd w:id="38"/>
+      <w:bookmarkStart w:id="69" w:name="tab:grupos"/>
+      <w:bookmarkEnd w:id="69"/>
     </w:p>
     <w:p>
       <w:pPr>
@@ -5191,12 +5461,21 @@
         <w:t xml:space="preserve">.</w:t>
       </w:r>
     </w:p>
-    <w:bookmarkEnd w:id="39"/>
-    <w:bookmarkStart w:id="40" w:name="herramientas-de-mantenimiento"/>
+    <w:bookmarkEnd w:id="70"/>
+    <w:bookmarkStart w:id="71" w:name="herramientas-de-mantenimiento"/>
     <w:p>
       <w:pPr>
         <w:pStyle w:val="Heading2"/>
       </w:pPr>
+      <w:r>
+        <w:rPr>
+          <w:rStyle w:val="SectionNumber"/>
+        </w:rPr>
+        <w:t xml:space="preserve">5.4</w:t>
+      </w:r>
+      <w:r>
+        <w:tab/>
+      </w:r>
       <w:r>
         <w:t xml:space="preserve">Herramientas de mantenimiento</w:t>
       </w:r>
@@ -5327,12 +5606,21 @@
         <w:t xml:space="preserve">.</w:t>
       </w:r>
     </w:p>
-    <w:bookmarkEnd w:id="40"/>
-    <w:bookmarkStart w:id="41" w:name="síntesis-cuantitativa"/>
+    <w:bookmarkEnd w:id="71"/>
+    <w:bookmarkStart w:id="72" w:name="síntesis-cuantitativa"/>
     <w:p>
       <w:pPr>
         <w:pStyle w:val="Heading2"/>
       </w:pPr>
+      <w:r>
+        <w:rPr>
+          <w:rStyle w:val="SectionNumber"/>
+        </w:rPr>
+        <w:t xml:space="preserve">5.5</w:t>
+      </w:r>
+      <w:r>
+        <w:tab/>
+      </w:r>
       <w:r>
         <w:t xml:space="preserve">Síntesis cuantitativa</w:t>
       </w:r>
@@ -5573,14 +5861,23 @@
         </w:tc>
       </w:tr>
     </w:tbl>
-    <w:bookmarkEnd w:id="41"/>
-    <w:bookmarkStart w:id="46" w:name="X9904ddc6eefce648af5381a526d40be5e9961a6"/>
+    <w:bookmarkEnd w:id="72"/>
+    <w:bookmarkStart w:id="77" w:name="validación-del-modo-historia-h3"/>
     <w:p>
       <w:pPr>
         <w:pStyle w:val="Heading2"/>
       </w:pPr>
       <w:r>
-        <w:t xml:space="preserve">Validación analítica del modo historia (H3)</w:t>
+        <w:rPr>
+          <w:rStyle w:val="SectionNumber"/>
+        </w:rPr>
+        <w:t xml:space="preserve">5.6</w:t>
+      </w:r>
+      <w:r>
+        <w:tab/>
+      </w:r>
+      <w:r>
+        <w:t xml:space="preserve">Validación del modo historia (H3)</w:t>
       </w:r>
     </w:p>
     <w:p>
@@ -5799,7 +6096,7 @@
         <w:t xml:space="preserve">Fácil/Media/Difícil con preguntas del banco cerrado.</w:t>
       </w:r>
     </w:p>
-    <w:bookmarkStart w:id="45" w:name="fig:flujo-historia"/>
+    <w:bookmarkStart w:id="76" w:name="fig:flujo-historia"/>
     <w:p>
       <w:pPr>
         <w:pStyle w:val="CaptionedFigure"/>
@@ -5809,18 +6106,18 @@
           <wp:inline>
             <wp:extent cx="5067300" cy="2187065"/>
             <wp:effectExtent b="0" l="0" r="0" t="0"/>
-            <wp:docPr descr="" title="" id="43" name="Picture"/>
+            <wp:docPr descr="" title="" id="74" name="Picture"/>
             <a:graphic>
               <a:graphicData uri="http://schemas.openxmlformats.org/drawingml/2006/picture">
                 <pic:pic>
                   <pic:nvPicPr>
-                    <pic:cNvPr descr="flujo_modo_historia.png" id="44" name="Picture"/>
+                    <pic:cNvPr descr="flujo_modo_historia.png" id="75" name="Picture"/>
                     <pic:cNvPicPr>
                       <a:picLocks noChangeArrowheads="1" noChangeAspect="1"/>
                     </pic:cNvPicPr>
                   </pic:nvPicPr>
                   <pic:blipFill>
-                    <a:blip r:embed="rId42"/>
+                    <a:blip r:embed="rId73"/>
                     <a:stretch>
                       <a:fillRect/>
                     </a:stretch>
@@ -5855,7 +6152,7 @@
         <w:t xml:space="preserve">Pipeline del generador de examen balanceado (modo historia).</w:t>
       </w:r>
     </w:p>
-    <w:bookmarkEnd w:id="45"/>
+    <w:bookmarkEnd w:id="76"/>
     <w:p>
       <w:pPr>
         <w:pStyle w:val="BodyText"/>
@@ -6157,14 +6454,23 @@
         <w:t xml:space="preserve">Estos valores orientan la ponderación del modo historia; un piloto con estudiantes permitiría contrastar si los exámenes generados se perciben alineados con la exigencia real del grado.</w:t>
       </w:r>
     </w:p>
-    <w:bookmarkEnd w:id="46"/>
-    <w:bookmarkStart w:id="55" w:name="X991fcbaeeebbdddd3eb63bc9a58a307cb37a1ec"/>
+    <w:bookmarkEnd w:id="77"/>
+    <w:bookmarkStart w:id="86" w:name="simulación-monte-carlo"/>
     <w:p>
       <w:pPr>
         <w:pStyle w:val="Heading2"/>
       </w:pPr>
       <w:r>
-        <w:t xml:space="preserve">Simulación Monte Carlo de la evaluación (respuestas al azar)</w:t>
+        <w:rPr>
+          <w:rStyle w:val="SectionNumber"/>
+        </w:rPr>
+        <w:t xml:space="preserve">5.7</w:t>
+      </w:r>
+      <w:r>
+        <w:tab/>
+      </w:r>
+      <w:r>
+        <w:t xml:space="preserve">Simulación Monte Carlo</w:t>
       </w:r>
     </w:p>
     <w:p>
@@ -6172,7 +6478,7 @@
         <w:pStyle w:val="FirstParagraph"/>
       </w:pPr>
       <w:r>
-        <w:t xml:space="preserve">Para validar que el motor de corrección penaliza el azar como cabría esperar en un examen tipo test, se implementó</w:t>
+        <w:t xml:space="preserve">Para comprobar que el motor de corrección penaliza el azar como en un test de opción múltiple, se implementó</w:t>
       </w:r>
       <w:r>
         <w:t xml:space="preserve"> </w:t>
@@ -6184,10 +6490,54 @@
         <w:t xml:space="preserve">Files/simulacion_evaluacion_azar.py</w:t>
       </w:r>
       <w:r>
-        <w:t xml:space="preserve"> </w:t>
-      </w:r>
-      <w:r>
-        <w:t xml:space="preserve">y se formalizó el experimento en términos probabilísticos. En cada ítem, la respuesta del jugador que contesta al azar se modela como una variable de Bernoulli</w:t>
+        <w:t xml:space="preserve">. En cada réplica se extraen preguntas del banco cerrado y la letra A–D se elige al azar con probabilidad uniforme (</w:t>
+      </w:r>
+      <m:oMath>
+        <m:r>
+          <m:t>p</m:t>
+        </m:r>
+        <m:r>
+          <m:rPr>
+            <m:sty m:val="p"/>
+          </m:rPr>
+          <m:t>=</m:t>
+        </m:r>
+        <m:r>
+          <m:t>1</m:t>
+        </m:r>
+        <m:r>
+          <m:rPr>
+            <m:sty m:val="p"/>
+          </m:rPr>
+          <m:t>/</m:t>
+        </m:r>
+        <m:r>
+          <m:t>4</m:t>
+        </m:r>
+      </m:oMath>
+      <w:r>
+        <w:t xml:space="preserve"> </w:t>
+      </w:r>
+      <w:r>
+        <w:t xml:space="preserve">por ítem).</w:t>
+      </w:r>
+    </w:p>
+    <w:p>
+      <w:pPr>
+        <w:pStyle w:val="BodyText"/>
+      </w:pPr>
+      <w:r>
+        <w:rPr>
+          <w:b/>
+          <w:bCs/>
+        </w:rPr>
+        <w:t xml:space="preserve">Modo examen (sin vidas).</w:t>
+      </w:r>
+      <w:r>
+        <w:t xml:space="preserve"> </w:t>
+      </w:r>
+      <w:r>
+        <w:t xml:space="preserve">Cada acierto se modela como</w:t>
       </w:r>
       <w:r>
         <w:t xml:space="preserve"> </w:t>
@@ -6285,14 +6635,14 @@
         <w:t xml:space="preserve"> </w:t>
       </w:r>
       <w:r>
-        <w:t xml:space="preserve">con</w:t>
+        <w:t xml:space="preserve">independiente. En un bloque de</w:t>
       </w:r>
       <w:r>
         <w:t xml:space="preserve"> </w:t>
       </w:r>
       <m:oMath>
         <m:r>
-          <m:t>p</m:t>
+          <m:t>n</m:t>
         </m:r>
         <m:r>
           <m:rPr>
@@ -6301,43 +6651,14 @@
           <m:t>=</m:t>
         </m:r>
         <m:r>
-          <m:t>1</m:t>
-        </m:r>
-        <m:r>
-          <m:rPr>
-            <m:sty m:val="p"/>
-          </m:rPr>
-          <m:t>/</m:t>
-        </m:r>
-        <m:r>
-          <m:t>4</m:t>
+          <m:t>20</m:t>
         </m:r>
       </m:oMath>
       <w:r>
-        <w:t xml:space="preserve">, al elegir uniformemente entre las cuatro opciones A–D. El número de aciertos en un bloque de</w:t>
-      </w:r>
-      <w:r>
-        <w:t xml:space="preserve"> </w:t>
-      </w:r>
-      <m:oMath>
-        <m:r>
-          <m:t>n</m:t>
-        </m:r>
-        <m:r>
-          <m:rPr>
-            <m:sty m:val="p"/>
-          </m:rPr>
-          <m:t>=</m:t>
-        </m:r>
-        <m:r>
-          <m:t>20</m:t>
-        </m:r>
-      </m:oMath>
-      <w:r>
-        <w:t xml:space="preserve"> </w:t>
-      </w:r>
-      <w:r>
-        <w:t xml:space="preserve">preguntas es entonces</w:t>
+        <w:t xml:space="preserve"> </w:t>
+      </w:r>
+      <w:r>
+        <w:t xml:space="preserve">preguntas,</w:t>
       </w:r>
     </w:p>
     <w:p>
@@ -6494,7 +6815,7 @@
         <w:pStyle w:val="FirstParagraph"/>
       </w:pPr>
       <w:r>
-        <w:t xml:space="preserve">con valor esperado</w:t>
+        <w:t xml:space="preserve">con</w:t>
       </w:r>
       <w:r>
         <w:t xml:space="preserve"> </w:t>
@@ -6548,7 +6869,7 @@
         <w:t xml:space="preserve"> </w:t>
       </w:r>
       <w:r>
-        <w:t xml:space="preserve">y varianza</w:t>
+        <w:t xml:space="preserve">y</w:t>
       </w:r>
       <w:r>
         <w:t xml:space="preserve"> </w:t>
@@ -6643,7 +6964,7 @@
         </m:r>
       </m:oMath>
       <w:r>
-        <w:t xml:space="preserve">. La nota del motor, definida como</w:t>
+        <w:t xml:space="preserve">. La nota del motor,</w:t>
       </w:r>
       <w:r>
         <w:t xml:space="preserve"> </w:t>
@@ -6699,61 +7020,12 @@
         </m:r>
       </m:oMath>
       <w:r>
-        <w:t xml:space="preserve">, verifica</w:t>
+        <w:t xml:space="preserve">, tiene valor esperado</w:t>
       </w:r>
       <w:r>
         <w:t xml:space="preserve"> </w:t>
       </w:r>
       <m:oMath>
-        <m:r>
-          <m:rPr>
-            <m:scr m:val="double-struck"/>
-            <m:sty m:val="p"/>
-          </m:rPr>
-          <m:t>E</m:t>
-        </m:r>
-        <m:r>
-          <m:rPr>
-            <m:sty m:val="p"/>
-          </m:rPr>
-          <m:t>[</m:t>
-        </m:r>
-        <m:r>
-          <m:rPr>
-            <m:sty m:val="p"/>
-          </m:rPr>
-          <m:t>n</m:t>
-        </m:r>
-        <m:r>
-          <m:rPr>
-            <m:sty m:val="p"/>
-          </m:rPr>
-          <m:t>o</m:t>
-        </m:r>
-        <m:r>
-          <m:rPr>
-            <m:sty m:val="p"/>
-          </m:rPr>
-          <m:t>t</m:t>
-        </m:r>
-        <m:r>
-          <m:rPr>
-            <m:sty m:val="p"/>
-          </m:rPr>
-          <m:t>a</m:t>
-        </m:r>
-        <m:r>
-          <m:rPr>
-            <m:sty m:val="p"/>
-          </m:rPr>
-          <m:t>]</m:t>
-        </m:r>
-        <m:r>
-          <m:rPr>
-            <m:sty m:val="p"/>
-          </m:rPr>
-          <m:t>=</m:t>
-        </m:r>
         <m:r>
           <m:t>2</m:t>
         </m:r>
@@ -6768,7 +7040,7 @@
         </m:r>
       </m:oMath>
       <w:r>
-        <w:t xml:space="preserve">, coherente con el umbral de suspensión universitario.</w:t>
+        <w:t xml:space="preserve">, por debajo del umbral de aprobación universitario.</w:t>
       </w:r>
     </w:p>
     <w:p>
@@ -7049,7 +7321,7 @@
         <w:t xml:space="preserve"> </w:t>
       </w:r>
       <w:r>
-        <w:t xml:space="preserve">y semilla 42, la simulación arroja una fracción media de</w:t>
+        <w:t xml:space="preserve">y semilla 42, la fracción media es</w:t>
       </w:r>
       <w:r>
         <w:t xml:space="preserve"> </w:t>
@@ -7062,7 +7334,21 @@
         <w:t xml:space="preserve">24,98 %</w:t>
       </w:r>
       <w:r>
-        <w:t xml:space="preserve">, próxima al valor teórico (figura </w:t>
+        <w:t xml:space="preserve">, próxima al 25 % teórico. La figura </w:t>
+      </w:r>
+      <w:hyperlink w:anchor="fig:mc-histograma">
+        <w:r>
+          <w:rPr>
+            <w:rStyle w:val="Hyperlink"/>
+          </w:rPr>
+          <w:t xml:space="preserve">3</w:t>
+        </w:r>
+      </w:hyperlink>
+      <w:r>
+        <w:t xml:space="preserve"> </w:t>
+      </w:r>
+      <w:r>
+        <w:t xml:space="preserve">contrasta el histograma empírico de notas con la masa de probabilidad binomial; la figura </w:t>
       </w:r>
       <w:hyperlink w:anchor="fig:mc-convergencia">
         <w:r>
@@ -7073,24 +7359,72 @@
         </w:r>
       </w:hyperlink>
       <w:r>
-        <w:t xml:space="preserve">). La figura </w:t>
-      </w:r>
-      <w:hyperlink w:anchor="fig:mc-histograma">
-        <w:r>
-          <w:rPr>
-            <w:rStyle w:val="Hyperlink"/>
-          </w:rPr>
-          <w:t xml:space="preserve">3</w:t>
-        </w:r>
-      </w:hyperlink>
-      <w:r>
-        <w:t xml:space="preserve"> </w:t>
-      </w:r>
-      <w:r>
-        <w:t xml:space="preserve">contrasta el histograma empírico de notas con la masa de probabilidad binomial; la coincidencia visual confirma que la implementación reproduce el modelo probabilístico.</w:t>
-      </w:r>
-    </w:p>
-    <w:bookmarkStart w:id="50" w:name="fig:mc-histograma"/>
+        <w:t xml:space="preserve"> </w:t>
+      </w:r>
+      <w:r>
+        <w:t xml:space="preserve">muestra la convergencia de</w:t>
+      </w:r>
+      <w:r>
+        <w:t xml:space="preserve"> </w:t>
+      </w:r>
+      <m:oMath>
+        <m:sSub>
+          <m:e>
+            <m:acc>
+              <m:accPr>
+                <m:chr m:val="̂"/>
+              </m:accPr>
+              <m:e>
+                <m:r>
+                  <m:t>p</m:t>
+                </m:r>
+              </m:e>
+            </m:acc>
+          </m:e>
+          <m:sub>
+            <m:r>
+              <m:t>N</m:t>
+            </m:r>
+          </m:sub>
+        </m:sSub>
+      </m:oMath>
+      <w:r>
+        <w:t xml:space="preserve"> </w:t>
+      </w:r>
+      <w:r>
+        <w:t xml:space="preserve">hacia</w:t>
+      </w:r>
+      <w:r>
+        <w:t xml:space="preserve"> </w:t>
+      </w:r>
+      <m:oMath>
+        <m:r>
+          <m:t>p</m:t>
+        </m:r>
+        <m:r>
+          <m:rPr>
+            <m:sty m:val="p"/>
+          </m:rPr>
+          <m:t>=</m:t>
+        </m:r>
+        <m:r>
+          <m:t>1</m:t>
+        </m:r>
+        <m:r>
+          <m:rPr>
+            <m:sty m:val="p"/>
+          </m:rPr>
+          <m:t>/</m:t>
+        </m:r>
+        <m:r>
+          <m:t>4</m:t>
+        </m:r>
+      </m:oMath>
+      <w:r>
+        <w:t xml:space="preserve">. La coincidencia confirma que la implementación reproduce el modelo probabilístico.</w:t>
+      </w:r>
+    </w:p>
+    <w:bookmarkStart w:id="81" w:name="fig:mc-histograma"/>
     <w:p>
       <w:pPr>
         <w:pStyle w:val="CaptionedFigure"/>
@@ -7100,18 +7434,18 @@
           <wp:inline>
             <wp:extent cx="5227320" cy="2080227"/>
             <wp:effectExtent b="0" l="0" r="0" t="0"/>
-            <wp:docPr descr="" title="" id="48" name="Picture"/>
+            <wp:docPr descr="" title="" id="79" name="Picture"/>
             <a:graphic>
               <a:graphicData uri="http://schemas.openxmlformats.org/drawingml/2006/picture">
                 <pic:pic>
                   <pic:nvPicPr>
-                    <pic:cNvPr descr="monte_carlo_histograma_notas.png" id="49" name="Picture"/>
+                    <pic:cNvPr descr="monte_carlo_histograma_notas.png" id="80" name="Picture"/>
                     <pic:cNvPicPr>
                       <a:picLocks noChangeArrowheads="1" noChangeAspect="1"/>
                     </pic:cNvPicPr>
                   </pic:nvPicPr>
                   <pic:blipFill>
-                    <a:blip r:embed="rId47"/>
+                    <a:blip r:embed="rId78"/>
                     <a:stretch>
                       <a:fillRect/>
                     </a:stretch>
@@ -7146,8 +7480,8 @@
         <w:t xml:space="preserve">Histograma de la simulación (50 000 réplicas) frente a la distribución binomial teórica.</w:t>
       </w:r>
     </w:p>
-    <w:bookmarkEnd w:id="50"/>
-    <w:bookmarkStart w:id="54" w:name="fig:mc-convergencia"/>
+    <w:bookmarkEnd w:id="81"/>
+    <w:bookmarkStart w:id="85" w:name="fig:mc-convergencia"/>
     <w:p>
       <w:pPr>
         <w:pStyle w:val="CaptionedFigure"/>
@@ -7157,18 +7491,18 @@
           <wp:inline>
             <wp:extent cx="4693920" cy="2517930"/>
             <wp:effectExtent b="0" l="0" r="0" t="0"/>
-            <wp:docPr descr="" title="" id="52" name="Picture"/>
+            <wp:docPr descr="" title="" id="83" name="Picture"/>
             <a:graphic>
               <a:graphicData uri="http://schemas.openxmlformats.org/drawingml/2006/picture">
                 <pic:pic>
                   <pic:nvPicPr>
-                    <pic:cNvPr descr="monte_carlo_convergencia.png" id="53" name="Picture"/>
+                    <pic:cNvPr descr="monte_carlo_convergencia.png" id="84" name="Picture"/>
                     <pic:cNvPicPr>
                       <a:picLocks noChangeArrowheads="1" noChangeAspect="1"/>
                     </pic:cNvPicPr>
                   </pic:nvPicPr>
                   <pic:blipFill>
-                    <a:blip r:embed="rId51"/>
+                    <a:blip r:embed="rId82"/>
                     <a:stretch>
                       <a:fillRect/>
                     </a:stretch>
@@ -7265,29 +7599,23 @@
         <w:t xml:space="preserve">al aumentar el número de réplicas.</w:t>
       </w:r>
     </w:p>
-    <w:bookmarkEnd w:id="54"/>
+    <w:bookmarkEnd w:id="85"/>
     <w:p>
       <w:pPr>
         <w:pStyle w:val="BodyText"/>
       </w:pPr>
-      <w:r>
-        <w:t xml:space="preserve">En el</w:t>
-      </w:r>
-      <w:r>
-        <w:t xml:space="preserve"> </w:t>
-      </w:r>
       <w:r>
         <w:rPr>
           <w:b/>
           <w:bCs/>
         </w:rPr>
-        <w:t xml:space="preserve">modo arcade</w:t>
-      </w:r>
-      <w:r>
-        <w:t xml:space="preserve"> </w:t>
-      </w:r>
-      <w:r>
-        <w:t xml:space="preserve">con tres vidas, cada fallo consume una vida y la probabilidad de error por pregunta es</w:t>
+        <w:t xml:space="preserve">Modo libre (preset arcade, 3 vidas).</w:t>
+      </w:r>
+      <w:r>
+        <w:t xml:space="preserve"> </w:t>
+      </w:r>
+      <w:r>
+        <w:t xml:space="preserve">Se replica el esquema de vidas y puntuación arcade descrito en §4.3 (sin dificultad progresiva ni temporizador, para aislar el efecto del azar). Cada fallo resta una vida; con respuesta al azar, la probabilidad de error por pregunta es</w:t>
       </w:r>
       <w:r>
         <w:t xml:space="preserve"> </w:t>
@@ -7316,41 +7644,7 @@
         </m:r>
       </m:oMath>
       <w:r>
-        <w:t xml:space="preserve">. El número de preguntas respondidas hasta agotar las vidas coincide, en ausencia de límite superior, con el número de ensayos hasta observar</w:t>
-      </w:r>
-      <w:r>
-        <w:t xml:space="preserve"> </w:t>
-      </w:r>
-      <m:oMath>
-        <m:r>
-          <m:t>r</m:t>
-        </m:r>
-        <m:r>
-          <m:rPr>
-            <m:sty m:val="p"/>
-          </m:rPr>
-          <m:t>=</m:t>
-        </m:r>
-        <m:r>
-          <m:t>3</m:t>
-        </m:r>
-      </m:oMath>
-      <w:r>
-        <w:t xml:space="preserve"> </w:t>
-      </w:r>
-      <w:r>
-        <w:t xml:space="preserve">fallos en ensayos de Bernoulli con probabilidad de «éxito»</w:t>
-      </w:r>
-      <w:r>
-        <w:t xml:space="preserve"> </w:t>
-      </w:r>
-      <m:oMath>
-        <m:r>
-          <m:t>q</m:t>
-        </m:r>
-      </m:oMath>
-      <w:r>
-        <w:t xml:space="preserve">; dicha variable sigue una ley binomial negativa con valor esperado</w:t>
+        <w:t xml:space="preserve">. El número de preguntas respondidas hasta el tercer fallo sigue una binomial negativa con valor esperado</w:t>
       </w:r>
       <w:r>
         <w:t xml:space="preserve"> </w:t>
@@ -7385,7 +7679,7 @@
           <m:t>=</m:t>
         </m:r>
         <m:r>
-          <m:t>r</m:t>
+          <m:t>3</m:t>
         </m:r>
         <m:r>
           <m:rPr>
@@ -7407,7 +7701,7 @@
         </m:r>
       </m:oMath>
       <w:r>
-        <w:t xml:space="preserve">, lo que explica la media empírica de</w:t>
+        <w:t xml:space="preserve">, coherente con la media empírica de</w:t>
       </w:r>
       <w:r>
         <w:t xml:space="preserve"> </w:t>
@@ -7423,7 +7717,7 @@
         <w:t xml:space="preserve"> </w:t>
       </w:r>
       <w:r>
-        <w:t xml:space="preserve">preguntas por partida. La probabilidad de completar las 20 preguntas sin perder las tres vidas es</w:t>
+        <w:t xml:space="preserve">preguntas por partida. La probabilidad de completar las 20 preguntas con solo dos fallos como máximo es</w:t>
       </w:r>
       <w:r>
         <w:t xml:space="preserve"> </w:t>
@@ -7788,7 +8082,7 @@
               <w:jc w:val="left"/>
             </w:pPr>
             <w:r>
-              <w:t xml:space="preserve">Modo arcade (3 vidas)</w:t>
+              <w:t xml:space="preserve">Modo libre (arcade, 3 vidas)</w:t>
             </w:r>
           </w:p>
         </w:tc>
@@ -7830,7 +8124,7 @@
               <w:jc w:val="left"/>
             </w:pPr>
             <w:r>
-              <w:t xml:space="preserve">Modo arcade</w:t>
+              <w:t xml:space="preserve">Modo libre (arcade)</w:t>
             </w:r>
           </w:p>
         </w:tc>
@@ -7878,7 +8172,7 @@
               <w:jc w:val="left"/>
             </w:pPr>
             <w:r>
-              <w:t xml:space="preserve">Modo arcade</w:t>
+              <w:t xml:space="preserve">Modo libre (arcade)</w:t>
             </w:r>
           </w:p>
         </w:tc>
@@ -7901,26 +8195,13 @@
               <w:pStyle w:val="Compact"/>
               <w:jc w:val="left"/>
             </w:pPr>
-            <m:oMath>
-              <m:r>
-                <m:rPr>
-                  <m:sty m:val="p"/>
-                </m:rPr>
-                <m:t>−</m:t>
-              </m:r>
-              <m:r>
-                <m:t>10</m:t>
-              </m:r>
-              <m:r>
-                <m:rPr>
-                  <m:sty m:val="p"/>
-                </m:rPr>
-                <m:t>,</m:t>
-              </m:r>
-              <m:r>
-                <m:t>0</m:t>
-              </m:r>
-            </m:oMath>
+            <w:r>
+              <w:rPr>
+                <w:b/>
+                <w:bCs/>
+              </w:rPr>
+              <w:t xml:space="preserve">-10,0</w:t>
+            </w:r>
           </w:p>
         </w:tc>
       </w:tr>
@@ -7930,7 +8211,7 @@
         <w:pStyle w:val="BodyText"/>
       </w:pPr>
       <w:r>
-        <w:t xml:space="preserve">En conjunto, el experimento demuestra que el azar produce suspensión sistemática y que, con vidas limitadas, impide completar bloques largos sin conocimiento real. Las figuras se regeneran con</w:t>
+        <w:t xml:space="preserve">En conjunto, el experimento muestra que el azar produce suspensión sistemática y que, con vidas limitadas, impide completar bloques largos sin conocimiento real. Las figuras se regeneran con</w:t>
       </w:r>
       <w:r>
         <w:t xml:space="preserve"> </w:t>
@@ -7957,22 +8238,40 @@
         <w:t xml:space="preserve">.</w:t>
       </w:r>
     </w:p>
-    <w:bookmarkEnd w:id="55"/>
-    <w:bookmarkEnd w:id="56"/>
-    <w:bookmarkStart w:id="63" w:name="discusión"/>
+    <w:bookmarkEnd w:id="86"/>
+    <w:bookmarkEnd w:id="87"/>
+    <w:bookmarkStart w:id="94" w:name="discusión"/>
     <w:p>
       <w:pPr>
         <w:pStyle w:val="Heading1"/>
       </w:pPr>
       <w:r>
+        <w:rPr>
+          <w:rStyle w:val="SectionNumber"/>
+        </w:rPr>
+        <w:t xml:space="preserve">6</w:t>
+      </w:r>
+      <w:r>
+        <w:tab/>
+      </w:r>
+      <w:r>
         <w:t xml:space="preserve">Discusión</w:t>
       </w:r>
     </w:p>
-    <w:bookmarkStart w:id="57" w:name="cumplimiento-de-los-objetivos"/>
+    <w:bookmarkStart w:id="88" w:name="cumplimiento-de-los-objetivos"/>
     <w:p>
       <w:pPr>
         <w:pStyle w:val="Heading2"/>
       </w:pPr>
+      <w:r>
+        <w:rPr>
+          <w:rStyle w:val="SectionNumber"/>
+        </w:rPr>
+        <w:t xml:space="preserve">6.1</w:t>
+      </w:r>
+      <w:r>
+        <w:tab/>
+      </w:r>
       <w:r>
         <w:t xml:space="preserve">Cumplimiento de los objetivos</w:t>
       </w:r>
@@ -8382,13 +8681,22 @@
         <w:t xml:space="preserve">OE2, OE3, OE4 y OE5 están cubiertos en la versión pygame. OE1 (narrativa gráfica completa tipo escape room) queda como trabajo futuro. El enfoque incremental —primero validar el núcleo evaluable, después la capa visual— permitió concentrar el esfuerzo en un único lanzador mantenible.</w:t>
       </w:r>
     </w:p>
-    <w:bookmarkEnd w:id="57"/>
-    <w:bookmarkStart w:id="58" w:name="validez-del-banco-de-preguntas"/>
+    <w:bookmarkEnd w:id="88"/>
+    <w:bookmarkStart w:id="89" w:name="validez-del-banco-de-preguntas"/>
     <w:p>
       <w:pPr>
         <w:pStyle w:val="Heading2"/>
       </w:pPr>
       <w:r>
+        <w:rPr>
+          <w:rStyle w:val="SectionNumber"/>
+        </w:rPr>
+        <w:t xml:space="preserve">6.2</w:t>
+      </w:r>
+      <w:r>
+        <w:tab/>
+      </w:r>
+      <w:r>
         <w:t xml:space="preserve">Validez del banco de preguntas</w:t>
       </w:r>
     </w:p>
@@ -8397,81 +8705,7 @@
         <w:pStyle w:val="FirstParagraph"/>
       </w:pPr>
       <w:r>
-        <w:t xml:space="preserve">La</w:t>
-      </w:r>
-      <w:r>
-        <w:t xml:space="preserve"> </w:t>
-      </w:r>
-      <w:r>
-        <w:rPr>
-          <w:b/>
-          <w:bCs/>
-        </w:rPr>
-        <w:t xml:space="preserve">validez de contenido</w:t>
-      </w:r>
-      <w:r>
-        <w:t xml:space="preserve"> </w:t>
-      </w:r>
-      <w:r>
-        <w:t xml:space="preserve">se abordó mediante revisión manual exhaustiva y criterios de redacción acordados. La</w:t>
-      </w:r>
-      <w:r>
-        <w:t xml:space="preserve"> </w:t>
-      </w:r>
-      <w:r>
-        <w:rPr>
-          <w:b/>
-          <w:bCs/>
-        </w:rPr>
-        <w:t xml:space="preserve">validez estructural</w:t>
-      </w:r>
-      <w:r>
-        <w:t xml:space="preserve"> </w:t>
-      </w:r>
-      <w:r>
-        <w:t xml:space="preserve">se garantiza con reglas de balance automatizadas. La</w:t>
-      </w:r>
-      <w:r>
-        <w:t xml:space="preserve"> </w:t>
-      </w:r>
-      <w:r>
-        <w:rPr>
-          <w:b/>
-          <w:bCs/>
-        </w:rPr>
-        <w:t xml:space="preserve">validez semántica</w:t>
-      </w:r>
-      <w:r>
-        <w:t xml:space="preserve"> </w:t>
-      </w:r>
-      <w:r>
-        <w:t xml:space="preserve">fina se reforzó en junio de 2026 (sustitución de pares similares en CSV y deduplicación del pool de plantillas;</w:t>
-      </w:r>
-      <w:r>
-        <w:t xml:space="preserve"> </w:t>
-      </w:r>
-      <w:r>
-        <w:rPr>
-          <w:rStyle w:val="VerbatimChar"/>
-        </w:rPr>
-        <w:t xml:space="preserve">duplicados.py revisar</w:t>
-      </w:r>
-      <w:r>
-        <w:t xml:space="preserve"> </w:t>
-      </w:r>
-      <m:oMath>
-        <m:r>
-          <m:rPr>
-            <m:sty m:val="p"/>
-          </m:rPr>
-          <m:t>→</m:t>
-        </m:r>
-      </m:oMath>
-      <w:r>
-        <w:t xml:space="preserve"> </w:t>
-      </w:r>
-      <w:r>
-        <w:t xml:space="preserve">0 pares similares). Queda abierta:</w:t>
+        <w:t xml:space="preserve">La calidad del banco se articula en varias capas complementarias:</w:t>
       </w:r>
     </w:p>
     <w:p>
@@ -8482,31 +8716,146 @@
         </w:numPr>
       </w:pPr>
       <w:r>
-        <w:t xml:space="preserve">la</w:t>
-      </w:r>
-      <w:r>
-        <w:t xml:space="preserve"> </w:t>
-      </w:r>
-      <w:r>
         <w:rPr>
           <w:b/>
           <w:bCs/>
         </w:rPr>
+        <w:t xml:space="preserve">Validez de contenido:</w:t>
+      </w:r>
+      <w:r>
+        <w:t xml:space="preserve"> </w:t>
+      </w:r>
+      <w:r>
+        <w:t xml:space="preserve">revisión manual de los 480 ítems y criterios de redacción acordados (§4.2): enunciados genéricos, coherencia con el nivel de la materia, distractores plausibles y auditoría automatizada (</w:t>
+      </w:r>
+      <w:r>
+        <w:rPr>
+          <w:rStyle w:val="VerbatimChar"/>
+        </w:rPr>
+        <w:t xml:space="preserve">mantenimiento.py auditar-distractores</w:t>
+      </w:r>
+      <w:r>
+        <w:t xml:space="preserve">).</w:t>
+      </w:r>
+    </w:p>
+    <w:p>
+      <w:pPr>
+        <w:numPr>
+          <w:ilvl w:val="0"/>
+          <w:numId w:val="1005"/>
+        </w:numPr>
+      </w:pPr>
+      <w:r>
+        <w:rPr>
+          <w:b/>
+          <w:bCs/>
+        </w:rPr>
+        <w:t xml:space="preserve">Integridad estructural del esquema:</w:t>
+      </w:r>
+      <w:r>
+        <w:t xml:space="preserve"> </w:t>
+      </w:r>
+      <w:r>
+        <w:t xml:space="preserve">reglas de balance y orden canónico verificadas con</w:t>
+      </w:r>
+      <w:r>
+        <w:t xml:space="preserve"> </w:t>
+      </w:r>
+      <w:r>
+        <w:rPr>
+          <w:rStyle w:val="VerbatimChar"/>
+        </w:rPr>
+        <w:t xml:space="preserve">mantenimiento.py validar</w:t>
+      </w:r>
+      <w:r>
+        <w:t xml:space="preserve"> </w:t>
+      </w:r>
+      <w:r>
+        <w:t xml:space="preserve">(distribución por dificultad, tipo, letra correcta y patrón 2FT…2DC por materia).</w:t>
+      </w:r>
+    </w:p>
+    <w:p>
+      <w:pPr>
+        <w:numPr>
+          <w:ilvl w:val="0"/>
+          <w:numId w:val="1005"/>
+        </w:numPr>
+      </w:pPr>
+      <w:r>
+        <w:rPr>
+          <w:b/>
+          <w:bCs/>
+        </w:rPr>
+        <w:t xml:space="preserve">Unicidad semántica:</w:t>
+      </w:r>
+      <w:r>
+        <w:t xml:space="preserve"> </w:t>
+      </w:r>
+      <w:r>
+        <w:t xml:space="preserve">en junio de 2026 se sustituyeron pares similares en el CSV y se deduplicó el pool de plantillas;</w:t>
+      </w:r>
+      <w:r>
+        <w:t xml:space="preserve"> </w:t>
+      </w:r>
+      <w:r>
+        <w:rPr>
+          <w:rStyle w:val="VerbatimChar"/>
+        </w:rPr>
+        <w:t xml:space="preserve">duplicados.py revisar</w:t>
+      </w:r>
+      <w:r>
+        <w:t xml:space="preserve"> </w:t>
+      </w:r>
+      <w:r>
+        <w:t xml:space="preserve">reporta</w:t>
+      </w:r>
+      <w:r>
+        <w:t xml:space="preserve"> </w:t>
+      </w:r>
+      <w:r>
+        <w:rPr>
+          <w:b/>
+          <w:bCs/>
+        </w:rPr>
+        <w:t xml:space="preserve">0 pares similares</w:t>
+      </w:r>
+      <w:r>
+        <w:t xml:space="preserve"> </w:t>
+      </w:r>
+      <w:r>
+        <w:t xml:space="preserve">en el banco de producción y en plantillas intra-materia (véase §5.1).</w:t>
+      </w:r>
+    </w:p>
+    <w:p>
+      <w:pPr>
+        <w:pStyle w:val="FirstParagraph"/>
+      </w:pPr>
+      <w:r>
+        <w:t xml:space="preserve">La</w:t>
+      </w:r>
+      <w:r>
+        <w:t xml:space="preserve"> </w:t>
+      </w:r>
+      <w:r>
+        <w:rPr>
+          <w:b/>
+          <w:bCs/>
+        </w:rPr>
         <w:t xml:space="preserve">validez predictiva</w:t>
       </w:r>
       <w:r>
         <w:t xml:space="preserve"> </w:t>
       </w:r>
       <w:r>
-        <w:t xml:space="preserve">(relación entre desempeño en el juego y desempeño académico real), no medida en este TFG.</w:t>
-      </w:r>
-    </w:p>
-    <w:p>
-      <w:pPr>
-        <w:pStyle w:val="FirstParagraph"/>
-      </w:pPr>
-      <w:r>
-        <w:t xml:space="preserve">La revisión con profesorado puso de manifiesto limitaciones del modelo de una sola etiqueta</w:t>
+        <w:t xml:space="preserve">(relación entre desempeño en el juego y rendimiento académico real) no se ha medido en este TFG.</w:t>
+      </w:r>
+    </w:p>
+    <w:p>
+      <w:pPr>
+        <w:pStyle w:val="BodyText"/>
+      </w:pPr>
+      <w:r>
+        <w:t xml:space="preserve">Durante el seguimiento del trabajo, la revisión con el tutor y el profesorado señaló dos limitaciones del modelo de una sola etiqueta</w:t>
       </w:r>
       <w:r>
         <w:t xml:space="preserve"> </w:t>
@@ -8539,7 +8888,7 @@
         <w:t xml:space="preserve"> </w:t>
       </w:r>
       <w:r>
-        <w:t xml:space="preserve">preguntas que encajan en varias asignaturas (p. ej. inferencia en Probabilidad y en Modelización e Inferencia).</w:t>
+        <w:t xml:space="preserve">ítems que encajan en varias asignaturas (p. ej. inferencia en Probabilidad y en Modelización e Inferencia).</w:t>
       </w:r>
     </w:p>
     <w:p>
@@ -8560,7 +8909,7 @@
         <w:t xml:space="preserve"> </w:t>
       </w:r>
       <w:r>
-        <w:t xml:space="preserve">preguntas de cursos avanzados que asumen conceptos de materias previas (p. ej. optimización y cálculo multivariable).</w:t>
+        <w:t xml:space="preserve">ítems de cursos avanzados que asumen conceptos de materias previas (p. ej. optimización y cálculo multivariable).</w:t>
       </w:r>
     </w:p>
     <w:p>
@@ -8568,7 +8917,7 @@
         <w:pStyle w:val="FirstParagraph"/>
       </w:pPr>
       <w:r>
-        <w:t xml:space="preserve">Estas observaciones motivan la propuesta de campos</w:t>
+        <w:t xml:space="preserve">Estas observaciones motivan los campos</w:t>
       </w:r>
       <w:r>
         <w:t xml:space="preserve"> </w:t>
@@ -8598,17 +8947,26 @@
         <w:t xml:space="preserve"> </w:t>
       </w:r>
       <w:r>
-        <w:t xml:space="preserve">en futuras versiones del esquema.</w:t>
-      </w:r>
-    </w:p>
-    <w:bookmarkEnd w:id="58"/>
-    <w:bookmarkStart w:id="59" w:name="X78d0583836687d5e062c63bb98a0761452a1157"/>
+        <w:t xml:space="preserve">propuestos para futuras versiones del esquema (§6.6).</w:t>
+      </w:r>
+    </w:p>
+    <w:bookmarkEnd w:id="89"/>
+    <w:bookmarkStart w:id="90" w:name="utilidad-formativa"/>
     <w:p>
       <w:pPr>
         <w:pStyle w:val="Heading2"/>
       </w:pPr>
       <w:r>
-        <w:t xml:space="preserve">Utilidad para autoevaluación y apoyo docente</w:t>
+        <w:rPr>
+          <w:rStyle w:val="SectionNumber"/>
+        </w:rPr>
+        <w:t xml:space="preserve">6.3</w:t>
+      </w:r>
+      <w:r>
+        <w:tab/>
+      </w:r>
+      <w:r>
+        <w:t xml:space="preserve">Utilidad formativa</w:t>
       </w:r>
     </w:p>
     <w:p>
@@ -8708,12 +9066,21 @@
         <w:t xml:space="preserve">).</w:t>
       </w:r>
     </w:p>
-    <w:bookmarkEnd w:id="59"/>
-    <w:bookmarkStart w:id="60" w:name="relación-con-las-hipótesis"/>
+    <w:bookmarkEnd w:id="90"/>
+    <w:bookmarkStart w:id="91" w:name="relación-con-las-hipótesis"/>
     <w:p>
       <w:pPr>
         <w:pStyle w:val="Heading2"/>
       </w:pPr>
+      <w:r>
+        <w:rPr>
+          <w:rStyle w:val="SectionNumber"/>
+        </w:rPr>
+        <w:t xml:space="preserve">6.4</w:t>
+      </w:r>
+      <w:r>
+        <w:tab/>
+      </w:r>
       <w:r>
         <w:t xml:space="preserve">Relación con las hipótesis</w:t>
       </w:r>
@@ -8774,12 +9141,21 @@
         <w:t xml:space="preserve">encuentra respaldo en el modo historia y en el análisis del histórico institucional (8818 registros), desarrollado en la sección 5.6. La simulación Monte Carlo de la sección 5.7 complementa estas hipótesis al verificar cuantitativamente que el motor de evaluación no concede aprobación al azar.</w:t>
       </w:r>
     </w:p>
-    <w:bookmarkEnd w:id="60"/>
-    <w:bookmarkStart w:id="61" w:name="limitaciones-del-estudio"/>
+    <w:bookmarkEnd w:id="91"/>
+    <w:bookmarkStart w:id="92" w:name="limitaciones-del-estudio"/>
     <w:p>
       <w:pPr>
         <w:pStyle w:val="Heading2"/>
       </w:pPr>
+      <w:r>
+        <w:rPr>
+          <w:rStyle w:val="SectionNumber"/>
+        </w:rPr>
+        <w:t xml:space="preserve">6.5</w:t>
+      </w:r>
+      <w:r>
+        <w:tab/>
+      </w:r>
       <w:r>
         <w:t xml:space="preserve">Limitaciones del estudio</w:t>
       </w:r>
@@ -8834,7 +9210,7 @@
         <w:t xml:space="preserve"> </w:t>
       </w:r>
       <w:r>
-        <w:t xml:space="preserve">asigna una sola materia por pregunta y aún no modela prerrequisitos explícitos. El</w:t>
+        <w:t xml:space="preserve">asigna una sola materia por pregunta y aún no modela prerrequisitos explícitos (véase §6.2). El</w:t>
       </w:r>
       <w:r>
         <w:t xml:space="preserve"> </w:t>
@@ -8869,12 +9245,21 @@
         <w:t xml:space="preserve">amplía el pool con plantillas no revisadas y debe distinguirse del banco de producción en cualquier evaluación formal.</w:t>
       </w:r>
     </w:p>
-    <w:bookmarkEnd w:id="61"/>
-    <w:bookmarkStart w:id="62" w:name="trabajo-futuro"/>
+    <w:bookmarkEnd w:id="92"/>
+    <w:bookmarkStart w:id="93" w:name="trabajo-futuro"/>
     <w:p>
       <w:pPr>
         <w:pStyle w:val="Heading2"/>
       </w:pPr>
+      <w:r>
+        <w:rPr>
+          <w:rStyle w:val="SectionNumber"/>
+        </w:rPr>
+        <w:t xml:space="preserve">6.6</w:t>
+      </w:r>
+      <w:r>
+        <w:tab/>
+      </w:r>
       <w:r>
         <w:t xml:space="preserve">Trabajo futuro</w:t>
       </w:r>
@@ -8934,13 +9319,22 @@
         <w:t xml:space="preserve">15–20, cuestionario SUS, tiempo de práctica) para contrastar si las mecánicas de juego aumentan la práctica respecto a un listado estático —línea no formulada como hipótesis contrastada en este TFG por ausencia de datos. La integración con plataformas institucionales (Moodle, AulaWeb) completaría el despliegue en el grado.</w:t>
       </w:r>
     </w:p>
-    <w:bookmarkEnd w:id="62"/>
-    <w:bookmarkEnd w:id="63"/>
-    <w:bookmarkStart w:id="64" w:name="conclusiones"/>
+    <w:bookmarkEnd w:id="93"/>
+    <w:bookmarkEnd w:id="94"/>
+    <w:bookmarkStart w:id="95" w:name="conclusiones"/>
     <w:p>
       <w:pPr>
         <w:pStyle w:val="Heading1"/>
       </w:pPr>
+      <w:r>
+        <w:rPr>
+          <w:rStyle w:val="SectionNumber"/>
+        </w:rPr>
+        <w:t xml:space="preserve">7</w:t>
+      </w:r>
+      <w:r>
+        <w:tab/>
+      </w:r>
       <w:r>
         <w:t xml:space="preserve">Conclusiones</w:t>
       </w:r>
@@ -9122,12 +9516,21 @@
         <w:t xml:space="preserve">La simulación Monte Carlo (§5.7) aporta una primera validación cuantitativa del motor de evaluación: el azar no permite aprobar ni completar partidas largas con vidas limitadas.</w:t>
       </w:r>
     </w:p>
-    <w:bookmarkEnd w:id="64"/>
-    <w:bookmarkStart w:id="73" w:name="bibliografía"/>
+    <w:bookmarkEnd w:id="95"/>
+    <w:bookmarkStart w:id="104" w:name="bibliografía"/>
     <w:p>
       <w:pPr>
         <w:pStyle w:val="Heading1"/>
       </w:pPr>
+      <w:r>
+        <w:rPr>
+          <w:rStyle w:val="SectionNumber"/>
+        </w:rPr>
+        <w:t xml:space="preserve">8</w:t>
+      </w:r>
+      <w:r>
+        <w:tab/>
+      </w:r>
       <w:r>
         <w:t xml:space="preserve">Bibliografía</w:t>
       </w:r>
@@ -9225,7 +9628,7 @@
       <w:r>
         <w:t xml:space="preserve"> </w:t>
       </w:r>
-      <w:hyperlink r:id="rId65">
+      <w:hyperlink r:id="rId96">
         <w:r>
           <w:rPr>
             <w:rStyle w:val="Hyperlink"/>
@@ -9270,7 +9673,7 @@
       <w:r>
         <w:t xml:space="preserve"> </w:t>
       </w:r>
-      <w:hyperlink r:id="rId66">
+      <w:hyperlink r:id="rId97">
         <w:r>
           <w:rPr>
             <w:rStyle w:val="Hyperlink"/>
@@ -9315,7 +9718,7 @@
       <w:r>
         <w:t xml:space="preserve"> </w:t>
       </w:r>
-      <w:hyperlink r:id="rId67">
+      <w:hyperlink r:id="rId98">
         <w:r>
           <w:rPr>
             <w:rStyle w:val="Hyperlink"/>
@@ -9360,7 +9763,7 @@
       <w:r>
         <w:t xml:space="preserve"> </w:t>
       </w:r>
-      <w:hyperlink r:id="rId68">
+      <w:hyperlink r:id="rId99">
         <w:r>
           <w:rPr>
             <w:rStyle w:val="Hyperlink"/>
@@ -9405,7 +9808,7 @@
       <w:r>
         <w:t xml:space="preserve"> </w:t>
       </w:r>
-      <w:hyperlink r:id="rId69">
+      <w:hyperlink r:id="rId100">
         <w:r>
           <w:rPr>
             <w:rStyle w:val="Hyperlink"/>
@@ -9471,7 +9874,7 @@
       <w:r>
         <w:t xml:space="preserve"> </w:t>
       </w:r>
-      <w:hyperlink r:id="rId70">
+      <w:hyperlink r:id="rId101">
         <w:r>
           <w:rPr>
             <w:rStyle w:val="Hyperlink"/>
@@ -9516,7 +9919,7 @@
       <w:r>
         <w:t xml:space="preserve"> </w:t>
       </w:r>
-      <w:hyperlink r:id="rId71">
+      <w:hyperlink r:id="rId102">
         <w:r>
           <w:rPr>
             <w:rStyle w:val="Hyperlink"/>
@@ -9561,7 +9964,7 @@
       <w:r>
         <w:t xml:space="preserve"> </w:t>
       </w:r>
-      <w:hyperlink r:id="rId72">
+      <w:hyperlink r:id="rId103">
         <w:r>
           <w:rPr>
             <w:rStyle w:val="Hyperlink"/>
@@ -9570,14 +9973,23 @@
         </w:r>
       </w:hyperlink>
     </w:p>
-    <w:bookmarkEnd w:id="73"/>
-    <w:bookmarkStart w:id="75" w:name="Xa64dd2c24157f2ab9510a3ab51cede95ea9eec8"/>
+    <w:bookmarkEnd w:id="104"/>
+    <w:bookmarkStart w:id="106" w:name="apéndices"/>
     <w:p>
       <w:pPr>
         <w:pStyle w:val="Heading1"/>
       </w:pPr>
       <w:r>
-        <w:t xml:space="preserve">Apéndices — documentación técnica del repositorio</w:t>
+        <w:rPr>
+          <w:rStyle w:val="SectionNumber"/>
+        </w:rPr>
+        <w:t xml:space="preserve">9</w:t>
+      </w:r>
+      <w:r>
+        <w:tab/>
+      </w:r>
+      <w:r>
+        <w:t xml:space="preserve">Apéndices</w:t>
       </w:r>
     </w:p>
     <w:tbl>
@@ -9694,7 +10106,236 @@
               <w:jc w:val="center"/>
             </w:pPr>
             <w:r>
-              <w:t xml:space="preserve">H</w:t>
+              <w:t xml:space="preserve">B</w:t>
+            </w:r>
+          </w:p>
+        </w:tc>
+        <w:tc>
+          <w:tcPr/>
+          <w:p>
+            <w:pPr>
+              <w:pStyle w:val="Compact"/>
+              <w:jc w:val="left"/>
+            </w:pPr>
+            <w:r>
+              <w:t xml:space="preserve">Arquitectura del juego, modos, puntuación, bancos beta</w:t>
+            </w:r>
+          </w:p>
+        </w:tc>
+        <w:tc>
+          <w:tcPr/>
+          <w:p>
+            <w:pPr>
+              <w:pStyle w:val="Compact"/>
+              <w:jc w:val="left"/>
+            </w:pPr>
+            <w:r>
+              <w:rPr>
+                <w:rStyle w:val="VerbatimChar"/>
+              </w:rPr>
+              <w:t xml:space="preserve">Juego/README.md</w:t>
+            </w:r>
+            <w:r>
+              <w:t xml:space="preserve">,</w:t>
+            </w:r>
+            <w:r>
+              <w:t xml:space="preserve"> </w:t>
+            </w:r>
+            <w:r>
+              <w:rPr>
+                <w:rStyle w:val="VerbatimChar"/>
+              </w:rPr>
+              <w:t xml:space="preserve">Juego/Comun/README.md</w:t>
+            </w:r>
+            <w:r>
+              <w:t xml:space="preserve">,</w:t>
+            </w:r>
+            <w:r>
+              <w:t xml:space="preserve"> </w:t>
+            </w:r>
+            <w:r>
+              <w:rPr>
+                <w:rStyle w:val="VerbatimChar"/>
+              </w:rPr>
+              <w:t xml:space="preserve">Juego/Grafico/README.md</w:t>
+            </w:r>
+          </w:p>
+        </w:tc>
+      </w:tr>
+      <w:tr>
+        <w:tc>
+          <w:tcPr/>
+          <w:p>
+            <w:pPr>
+              <w:pStyle w:val="Compact"/>
+              <w:jc w:val="center"/>
+            </w:pPr>
+            <w:r>
+              <w:t xml:space="preserve">C</w:t>
+            </w:r>
+          </w:p>
+        </w:tc>
+        <w:tc>
+          <w:tcPr/>
+          <w:p>
+            <w:pPr>
+              <w:pStyle w:val="Compact"/>
+              <w:jc w:val="left"/>
+            </w:pPr>
+            <w:r>
+              <w:t xml:space="preserve">Scripts de mantenimiento, balanceo, auditorías</w:t>
+            </w:r>
+          </w:p>
+        </w:tc>
+        <w:tc>
+          <w:tcPr/>
+          <w:p>
+            <w:pPr>
+              <w:pStyle w:val="Compact"/>
+              <w:jc w:val="left"/>
+            </w:pPr>
+            <w:r>
+              <w:rPr>
+                <w:rStyle w:val="VerbatimChar"/>
+              </w:rPr>
+              <w:t xml:space="preserve">Files/README.md</w:t>
+            </w:r>
+          </w:p>
+        </w:tc>
+      </w:tr>
+      <w:tr>
+        <w:tc>
+          <w:tcPr/>
+          <w:p>
+            <w:pPr>
+              <w:pStyle w:val="Compact"/>
+              <w:jc w:val="center"/>
+            </w:pPr>
+            <w:r>
+              <w:t xml:space="preserve">D</w:t>
+            </w:r>
+          </w:p>
+        </w:tc>
+        <w:tc>
+          <w:tcPr/>
+          <w:p>
+            <w:pPr>
+              <w:pStyle w:val="Compact"/>
+              <w:jc w:val="left"/>
+            </w:pPr>
+            <w:r>
+              <w:t xml:space="preserve">Pruebas unitarias</w:t>
+            </w:r>
+          </w:p>
+        </w:tc>
+        <w:tc>
+          <w:tcPr/>
+          <w:p>
+            <w:pPr>
+              <w:pStyle w:val="Compact"/>
+              <w:jc w:val="left"/>
+            </w:pPr>
+            <w:r>
+              <w:rPr>
+                <w:rStyle w:val="VerbatimChar"/>
+              </w:rPr>
+              <w:t xml:space="preserve">Tests/README.md</w:t>
+            </w:r>
+          </w:p>
+        </w:tc>
+      </w:tr>
+      <w:tr>
+        <w:tc>
+          <w:tcPr/>
+          <w:p>
+            <w:pPr>
+              <w:pStyle w:val="Compact"/>
+              <w:jc w:val="center"/>
+            </w:pPr>
+            <w:r>
+              <w:t xml:space="preserve">E</w:t>
+            </w:r>
+          </w:p>
+        </w:tc>
+        <w:tc>
+          <w:tcPr/>
+          <w:p>
+            <w:pPr>
+              <w:pStyle w:val="Compact"/>
+              <w:jc w:val="left"/>
+            </w:pPr>
+            <w:r>
+              <w:t xml:space="preserve">Repositorio y guía rápida</w:t>
+            </w:r>
+          </w:p>
+        </w:tc>
+        <w:tc>
+          <w:tcPr/>
+          <w:p>
+            <w:pPr>
+              <w:pStyle w:val="Compact"/>
+              <w:jc w:val="left"/>
+            </w:pPr>
+            <w:r>
+              <w:rPr>
+                <w:rStyle w:val="VerbatimChar"/>
+              </w:rPr>
+              <w:t xml:space="preserve">README.md</w:t>
+            </w:r>
+          </w:p>
+        </w:tc>
+      </w:tr>
+      <w:tr>
+        <w:tc>
+          <w:tcPr/>
+          <w:p>
+            <w:pPr>
+              <w:pStyle w:val="Compact"/>
+              <w:jc w:val="center"/>
+            </w:pPr>
+            <w:r>
+              <w:t xml:space="preserve">F</w:t>
+            </w:r>
+          </w:p>
+        </w:tc>
+        <w:tc>
+          <w:tcPr/>
+          <w:p>
+            <w:pPr>
+              <w:pStyle w:val="Compact"/>
+              <w:jc w:val="left"/>
+            </w:pPr>
+            <w:r>
+              <w:t xml:space="preserve">LaTeX, Word y exportación</w:t>
+            </w:r>
+          </w:p>
+        </w:tc>
+        <w:tc>
+          <w:tcPr/>
+          <w:p>
+            <w:pPr>
+              <w:pStyle w:val="Compact"/>
+              <w:jc w:val="left"/>
+            </w:pPr>
+            <w:r>
+              <w:rPr>
+                <w:rStyle w:val="VerbatimChar"/>
+              </w:rPr>
+              <w:t xml:space="preserve">Docs/README.md</w:t>
+            </w:r>
+          </w:p>
+        </w:tc>
+      </w:tr>
+      <w:tr>
+        <w:tc>
+          <w:tcPr/>
+          <w:p>
+            <w:pPr>
+              <w:pStyle w:val="Compact"/>
+              <w:jc w:val="center"/>
+            </w:pPr>
+            <w:r>
+              <w:t xml:space="preserve">G</w:t>
             </w:r>
           </w:p>
         </w:tc>
@@ -9750,235 +10391,6 @@
           </w:p>
         </w:tc>
       </w:tr>
-      <w:tr>
-        <w:tc>
-          <w:tcPr/>
-          <w:p>
-            <w:pPr>
-              <w:pStyle w:val="Compact"/>
-              <w:jc w:val="center"/>
-            </w:pPr>
-            <w:r>
-              <w:t xml:space="preserve">B</w:t>
-            </w:r>
-          </w:p>
-        </w:tc>
-        <w:tc>
-          <w:tcPr/>
-          <w:p>
-            <w:pPr>
-              <w:pStyle w:val="Compact"/>
-              <w:jc w:val="left"/>
-            </w:pPr>
-            <w:r>
-              <w:t xml:space="preserve">Arquitectura del juego, modos, puntuación, bancos beta</w:t>
-            </w:r>
-          </w:p>
-        </w:tc>
-        <w:tc>
-          <w:tcPr/>
-          <w:p>
-            <w:pPr>
-              <w:pStyle w:val="Compact"/>
-              <w:jc w:val="left"/>
-            </w:pPr>
-            <w:r>
-              <w:rPr>
-                <w:rStyle w:val="VerbatimChar"/>
-              </w:rPr>
-              <w:t xml:space="preserve">Juego/README.md</w:t>
-            </w:r>
-            <w:r>
-              <w:t xml:space="preserve">,</w:t>
-            </w:r>
-            <w:r>
-              <w:t xml:space="preserve"> </w:t>
-            </w:r>
-            <w:r>
-              <w:rPr>
-                <w:rStyle w:val="VerbatimChar"/>
-              </w:rPr>
-              <w:t xml:space="preserve">Juego/Comun/README.md</w:t>
-            </w:r>
-            <w:r>
-              <w:t xml:space="preserve">,</w:t>
-            </w:r>
-            <w:r>
-              <w:t xml:space="preserve"> </w:t>
-            </w:r>
-            <w:r>
-              <w:rPr>
-                <w:rStyle w:val="VerbatimChar"/>
-              </w:rPr>
-              <w:t xml:space="preserve">Juego/Grafico/README.md</w:t>
-            </w:r>
-          </w:p>
-        </w:tc>
-      </w:tr>
-      <w:tr>
-        <w:tc>
-          <w:tcPr/>
-          <w:p>
-            <w:pPr>
-              <w:pStyle w:val="Compact"/>
-              <w:jc w:val="center"/>
-            </w:pPr>
-            <w:r>
-              <w:t xml:space="preserve">C</w:t>
-            </w:r>
-          </w:p>
-        </w:tc>
-        <w:tc>
-          <w:tcPr/>
-          <w:p>
-            <w:pPr>
-              <w:pStyle w:val="Compact"/>
-              <w:jc w:val="left"/>
-            </w:pPr>
-            <w:r>
-              <w:t xml:space="preserve">Scripts de mantenimiento, balanceo, auditorías</w:t>
-            </w:r>
-          </w:p>
-        </w:tc>
-        <w:tc>
-          <w:tcPr/>
-          <w:p>
-            <w:pPr>
-              <w:pStyle w:val="Compact"/>
-              <w:jc w:val="left"/>
-            </w:pPr>
-            <w:r>
-              <w:rPr>
-                <w:rStyle w:val="VerbatimChar"/>
-              </w:rPr>
-              <w:t xml:space="preserve">Files/README.md</w:t>
-            </w:r>
-          </w:p>
-        </w:tc>
-      </w:tr>
-      <w:tr>
-        <w:tc>
-          <w:tcPr/>
-          <w:p>
-            <w:pPr>
-              <w:pStyle w:val="Compact"/>
-              <w:jc w:val="center"/>
-            </w:pPr>
-            <w:r>
-              <w:t xml:space="preserve">E</w:t>
-            </w:r>
-          </w:p>
-        </w:tc>
-        <w:tc>
-          <w:tcPr/>
-          <w:p>
-            <w:pPr>
-              <w:pStyle w:val="Compact"/>
-              <w:jc w:val="left"/>
-            </w:pPr>
-            <w:r>
-              <w:t xml:space="preserve">Pruebas unitarias</w:t>
-            </w:r>
-          </w:p>
-        </w:tc>
-        <w:tc>
-          <w:tcPr/>
-          <w:p>
-            <w:pPr>
-              <w:pStyle w:val="Compact"/>
-              <w:jc w:val="left"/>
-            </w:pPr>
-            <w:r>
-              <w:rPr>
-                <w:rStyle w:val="VerbatimChar"/>
-              </w:rPr>
-              <w:t xml:space="preserve">Tests/README.md</w:t>
-            </w:r>
-          </w:p>
-        </w:tc>
-      </w:tr>
-      <w:tr>
-        <w:tc>
-          <w:tcPr/>
-          <w:p>
-            <w:pPr>
-              <w:pStyle w:val="Compact"/>
-              <w:jc w:val="center"/>
-            </w:pPr>
-            <w:r>
-              <w:t xml:space="preserve">F</w:t>
-            </w:r>
-          </w:p>
-        </w:tc>
-        <w:tc>
-          <w:tcPr/>
-          <w:p>
-            <w:pPr>
-              <w:pStyle w:val="Compact"/>
-              <w:jc w:val="left"/>
-            </w:pPr>
-            <w:r>
-              <w:t xml:space="preserve">Repositorio y guía rápida</w:t>
-            </w:r>
-          </w:p>
-        </w:tc>
-        <w:tc>
-          <w:tcPr/>
-          <w:p>
-            <w:pPr>
-              <w:pStyle w:val="Compact"/>
-              <w:jc w:val="left"/>
-            </w:pPr>
-            <w:r>
-              <w:rPr>
-                <w:rStyle w:val="VerbatimChar"/>
-              </w:rPr>
-              <w:t xml:space="preserve">README.md</w:t>
-            </w:r>
-          </w:p>
-        </w:tc>
-      </w:tr>
-      <w:tr>
-        <w:tc>
-          <w:tcPr/>
-          <w:p>
-            <w:pPr>
-              <w:pStyle w:val="Compact"/>
-              <w:jc w:val="center"/>
-            </w:pPr>
-            <w:r>
-              <w:t xml:space="preserve">G</w:t>
-            </w:r>
-          </w:p>
-        </w:tc>
-        <w:tc>
-          <w:tcPr/>
-          <w:p>
-            <w:pPr>
-              <w:pStyle w:val="Compact"/>
-              <w:jc w:val="left"/>
-            </w:pPr>
-            <w:r>
-              <w:t xml:space="preserve">LaTeX, Word y exportación</w:t>
-            </w:r>
-          </w:p>
-        </w:tc>
-        <w:tc>
-          <w:tcPr/>
-          <w:p>
-            <w:pPr>
-              <w:pStyle w:val="Compact"/>
-              <w:jc w:val="left"/>
-            </w:pPr>
-            <w:r>
-              <w:rPr>
-                <w:rStyle w:val="VerbatimChar"/>
-              </w:rPr>
-              <w:t xml:space="preserve">Docs/README.md</w:t>
-            </w:r>
-          </w:p>
-        </w:tc>
-      </w:tr>
     </w:tbl>
     <w:p>
       <w:pPr>
@@ -9994,7 +10406,7 @@
       <w:r>
         <w:t xml:space="preserve"> </w:t>
       </w:r>
-      <w:hyperlink r:id="rId74">
+      <w:hyperlink r:id="rId105">
         <w:r>
           <w:rPr>
             <w:rStyle w:val="Hyperlink"/>
@@ -10003,11 +10415,12 @@
         </w:r>
       </w:hyperlink>
     </w:p>
-    <w:bookmarkEnd w:id="75"/>
+    <w:bookmarkEnd w:id="106"/>
     <w:sectPr>
       <w:footnotePr>
         <w:numRestart w:val="eachSect"/>
       </w:footnotePr>
+      <w:footerReference r:id="rId31" w:type="default"/>
     </w:sectPr>
   </w:body>
 </w:document>
@@ -10015,6 +10428,31 @@
 
 <file path=word/comments.xml><?xml version="1.0" encoding="utf-8"?>
 <w:comments xmlns:w="http://schemas.openxmlformats.org/wordprocessingml/2006/main" xmlns:m="http://schemas.openxmlformats.org/officeDocument/2006/math" xmlns:r="http://schemas.openxmlformats.org/officeDocument/2006/relationships" xmlns:o="urn:schemas-microsoft-com:office:office" xmlns:v="urn:schemas-microsoft-com:vml" xmlns:w10="urn:schemas-microsoft-com:office:word" xmlns:a="http://schemas.openxmlformats.org/drawingml/2006/main" xmlns:pic="http://schemas.openxmlformats.org/drawingml/2006/picture" xmlns:wp="http://schemas.openxmlformats.org/drawingml/2006/wordprocessingDrawing"/>
+</file>
+
+<file path=word/footer1.xml><?xml version="1.0" encoding="utf-8"?>
+<w:ftr xmlns:w="http://schemas.openxmlformats.org/wordprocessingml/2006/main" xmlns:r="http://schemas.openxmlformats.org/officeDocument/2006/relationships">
+  <w:p>
+    <w:pPr>
+      <w:jc w:val="center"/>
+    </w:pPr>
+    <w:r>
+      <w:fldChar w:fldCharType="begin"/>
+    </w:r>
+    <w:r>
+      <w:instrText xml:space="preserve"> PAGE </w:instrText>
+    </w:r>
+    <w:r>
+      <w:fldChar w:fldCharType="separate"/>
+    </w:r>
+    <w:r>
+      <w:t>1</w:t>
+    </w:r>
+    <w:r>
+      <w:fldChar w:fldCharType="end"/>
+    </w:r>
+  </w:p>
+</w:ftr>
 </file>
 
 <file path=word/footnotes.xml><?xml version="1.0" encoding="utf-8"?>
@@ -10673,8 +11111,6 @@
     </w:pPr>
     <w:rPr>
       <w:rFonts w:cstheme="majorBidi" w:eastAsiaTheme="majorEastAsia"/>
-      <w:i/>
-      <w:iCs/>
       <w:color w:themeColor="accent1" w:themeShade="BF" w:val="0F4761"/>
     </w:rPr>
   </w:style>
@@ -11056,7 +11492,7 @@
     <w:unhideWhenUsed/>
     <w:qFormat/>
     <w:pPr>
-      <w:spacing w:before="240" w:line="259" w:lineRule="auto"/>
+      <w:spacing w:before="0" w:after="140" w:line="336" w:lineRule="auto"/>
       <w:outlineLvl w:val="9"/>
     </w:pPr>
     <w:rPr>
@@ -11064,6 +11500,59 @@
       <w:b w:val="0"/>
       <w:bCs w:val="0"/>
       <w:color w:themeColor="accent1" w:themeShade="BF" w:val="365F91"/>
+      <w:sz w:val="28"/>
+      <w:szCs w:val="28"/>
+    </w:rPr>
+  </w:style>
+  <w:style w:styleId="TOC1" w:type="paragraph">
+    <w:name w:val="toc 1"/>
+    <w:basedOn w:val="Normal"/>
+    <w:next w:val="Normal"/>
+    <w:autoRedefine/>
+    <w:uiPriority w:val="39"/>
+    <w:unhideWhenUsed/>
+    <w:qFormat/>
+    <w:pPr>
+      <w:spacing w:before="0" w:after="0" w:line="288" w:lineRule="auto"/>
+      <w:ind w:left="220" w:hanging="220"/>
+    </w:pPr>
+    <w:rPr>
+      <w:sz w:val="24"/>
+      <w:szCs w:val="24"/>
+    </w:rPr>
+  </w:style>
+  <w:style w:styleId="TOC2" w:type="paragraph">
+    <w:name w:val="toc 2"/>
+    <w:basedOn w:val="Normal"/>
+    <w:next w:val="Normal"/>
+    <w:autoRedefine/>
+    <w:uiPriority w:val="39"/>
+    <w:unhideWhenUsed/>
+    <w:qFormat/>
+    <w:pPr>
+      <w:spacing w:before="0" w:after="0" w:line="276" w:lineRule="auto"/>
+      <w:ind w:left="360" w:hanging="180"/>
+    </w:pPr>
+    <w:rPr>
+      <w:sz w:val="22"/>
+      <w:szCs w:val="22"/>
+    </w:rPr>
+  </w:style>
+  <w:style w:styleId="TOC3" w:type="paragraph">
+    <w:name w:val="toc 3"/>
+    <w:basedOn w:val="Normal"/>
+    <w:next w:val="Normal"/>
+    <w:autoRedefine/>
+    <w:uiPriority w:val="39"/>
+    <w:unhideWhenUsed/>
+    <w:qFormat/>
+    <w:pPr>
+      <w:spacing w:before="0" w:after="0" w:line="276" w:lineRule="auto"/>
+      <w:ind w:left="480" w:hanging="180"/>
+    </w:pPr>
+    <w:rPr>
+      <w:sz w:val="22"/>
+      <w:szCs w:val="22"/>
     </w:rPr>
   </w:style>
   <w:style w:type="paragraph" w:customStyle="1" w:styleId="SourceCode">

</xml_diff>

<commit_message>
Completar escape room con tienda, botín de objetos e inventario.
Añade economía en tienda, botines con powerups y pity de descanso/tienda/botín; UI de inventario como en resistencia. Incluye zip portable (Data+Juego) en utilidades_tfg, limpieza de código obsoleto, tests ampliados y documentación al día.

Co-authored-by: Cursor <cursoragent@cursor.com>
</commit_message>
<xml_diff>
--- a/Docs/Entrega/Memoria_TFG_latex.docx
+++ b/Docs/Entrega/Memoria_TFG_latex.docx
@@ -75,7 +75,7 @@
         <w:t xml:space="preserve"> </w:t>
       </w:r>
       <w:r>
-        <w:t xml:space="preserve">con cuatro modos (libre, historia, resistencia y feedback), y herramientas de validación del dataset. El desarrollo siguió un enfoque incremental: primero un prototipo en terminal para validar el motor de evaluación y, después, una interfaz gráfica que concentra toda la experiencia de juego. Los resultados muestran un sistema funcional, documentado y extensible; la validación con usuarios y la narrativa gráfica quedan como trabajo futuro.</w:t>
+        <w:t xml:space="preserve">con cinco modos (libre, historia, resistencia, escape room y feedback), y herramientas de validación del dataset. El desarrollo siguió un enfoque incremental: primero un prototipo en terminal para validar el motor de evaluación y, después, una interfaz gráfica que concentra toda la experiencia de juego. Los resultados muestran un sistema funcional, documentado y extensible; la validación con usuarios y la narrativa gráfica quedan como trabajo futuro.</w:t>
       </w:r>
     </w:p>
     <w:p>
@@ -3662,13 +3662,13 @@
                 <w:b/>
                 <w:bCs/>
               </w:rPr>
-              <w:t xml:space="preserve">258</w:t>
+              <w:t xml:space="preserve">395</w:t>
             </w:r>
             <w:r>
               <w:t xml:space="preserve"> </w:t>
             </w:r>
             <w:r>
-              <w:t xml:space="preserve">tests: 250 + 8 en</w:t>
+              <w:t xml:space="preserve">tests: 387 + 8 en</w:t>
             </w:r>
             <w:r>
               <w:t xml:space="preserve"> </w:t>
@@ -4199,7 +4199,7 @@
         <w:t xml:space="preserve"> </w:t>
       </w:r>
       <w:r>
-        <w:t xml:space="preserve">con cuatro modos operativos (libre, historia, resistencia, feedback), banco de</w:t>
+        <w:t xml:space="preserve">con cinco modos operativos (libre, historia, resistencia, escape room, feedback), banco de</w:t>
       </w:r>
       <w:r>
         <w:t xml:space="preserve"> </w:t>
@@ -4215,7 +4215,23 @@
         <w:t xml:space="preserve"> </w:t>
       </w:r>
       <w:r>
-        <w:t xml:space="preserve">revisadas manualmente y herramientas de mantenimiento del dataset. La capa narrativa escape room / novela gráfica completa queda como evolución futura.</w:t>
+        <w:t xml:space="preserve">revisadas manualmente y herramientas de mantenimiento del dataset. El</w:t>
+      </w:r>
+      <w:r>
+        <w:t xml:space="preserve"> </w:t>
+      </w:r>
+      <w:r>
+        <w:rPr>
+          <w:b/>
+          <w:bCs/>
+        </w:rPr>
+        <w:t xml:space="preserve">modo escape room</w:t>
+      </w:r>
+      <w:r>
+        <w:t xml:space="preserve"> </w:t>
+      </w:r>
+      <w:r>
+        <w:t xml:space="preserve">implementa mecánicas de salas y puertas (tienda, botín, inventario); la narrativa gráfica completa queda como evolución futura.</w:t>
       </w:r>
     </w:p>
     <w:p>
@@ -5585,7 +5601,7 @@
           <w:b/>
           <w:bCs/>
         </w:rPr>
-        <w:t xml:space="preserve">258</w:t>
+        <w:t xml:space="preserve">395</w:t>
       </w:r>
       <w:r>
         <w:t xml:space="preserve"> </w:t>
@@ -5829,7 +5845,7 @@
               <w:jc w:val="left"/>
             </w:pPr>
             <w:r>
-              <w:t xml:space="preserve">258</w:t>
+              <w:t xml:space="preserve">395</w:t>
             </w:r>
           </w:p>
         </w:tc>
@@ -8297,7 +8313,23 @@
         <w:t xml:space="preserve"> </w:t>
       </w:r>
       <w:r>
-        <w:t xml:space="preserve">se cumple de forma parcial: existe un juego educativo interactivo basado en contenidos del grado, pero la progresión narrativa tipo escape room no está implementada. La progresión actual es ludificada (vidas, puntos, dificultad creciente) y curricular (filtros por etapa del grado).</w:t>
+        <w:t xml:space="preserve">se cumple de forma parcial: existe un juego educativo interactivo basado en contenidos del grado, con un</w:t>
+      </w:r>
+      <w:r>
+        <w:t xml:space="preserve"> </w:t>
+      </w:r>
+      <w:r>
+        <w:rPr>
+          <w:b/>
+          <w:bCs/>
+        </w:rPr>
+        <w:t xml:space="preserve">modo escape room</w:t>
+      </w:r>
+      <w:r>
+        <w:t xml:space="preserve"> </w:t>
+      </w:r>
+      <w:r>
+        <w:t xml:space="preserve">que estructura la partida en salas y puertas, aunque sin guion narrativo gráfico completo. La progresión actual es ludificada (vidas, puntos, dificultad creciente) y curricular (filtros por etapa del grado).</w:t>
       </w:r>
     </w:p>
     <w:tbl>
@@ -8414,19 +8446,19 @@
               <w:jc w:val="left"/>
             </w:pPr>
             <w:r>
-              <w:t xml:space="preserve">Pendiente (futuro)</w:t>
-            </w:r>
-          </w:p>
-        </w:tc>
-        <w:tc>
-          <w:tcPr/>
-          <w:p>
-            <w:pPr>
-              <w:pStyle w:val="Compact"/>
-              <w:jc w:val="left"/>
-            </w:pPr>
-            <w:r>
-              <w:t xml:space="preserve">Sin guion de escenas/salas implementado</w:t>
+              <w:t xml:space="preserve">Parcial</w:t>
+            </w:r>
+          </w:p>
+        </w:tc>
+        <w:tc>
+          <w:tcPr/>
+          <w:p>
+            <w:pPr>
+              <w:pStyle w:val="Compact"/>
+              <w:jc w:val="left"/>
+            </w:pPr>
+            <w:r>
+              <w:t xml:space="preserve">Modo escape room jugable; guion visual completo pendiente</w:t>
             </w:r>
           </w:p>
         </w:tc>
@@ -8597,7 +8629,7 @@
               <w:t xml:space="preserve"> </w:t>
             </w:r>
             <w:r>
-              <w:t xml:space="preserve">con libre, historia, resistencia y feedback; tooltips y barra superior</w:t>
+              <w:t xml:space="preserve">con libre, historia, resistencia, escape room y feedback</w:t>
             </w:r>
           </w:p>
         </w:tc>
@@ -8651,7 +8683,7 @@
               <w:jc w:val="left"/>
             </w:pPr>
             <w:r>
-              <w:t xml:space="preserve">Banco validado, 258 tests + CI; sin estudio con usuarios</w:t>
+              <w:t xml:space="preserve">Banco validado, 395 tests + CI; sin estudio con usuarios</w:t>
             </w:r>
           </w:p>
         </w:tc>
@@ -8678,7 +8710,7 @@
         <w:t xml:space="preserve"> </w:t>
       </w:r>
       <w:r>
-        <w:t xml:space="preserve">OE2, OE3, OE4 y OE5 están cubiertos en la versión pygame. OE1 (narrativa gráfica completa tipo escape room) queda como trabajo futuro. El enfoque incremental —primero validar el núcleo evaluable, después la capa visual— permitió concentrar el esfuerzo en un único lanzador mantenible.</w:t>
+        <w:t xml:space="preserve">OE2, OE3, OE4 y OE5 están cubiertos en la versión pygame. OE1 (narrativa gráfica completa) queda parcialmente cubierto por las mecánicas del escape room y como trabajo futuro en arte y guion. El enfoque incremental —primero validar el núcleo evaluable, después la capa visual— permitió concentrar el esfuerzo en un único lanzador mantenible.</w:t>
       </w:r>
     </w:p>
     <w:bookmarkEnd w:id="88"/>
@@ -9194,7 +9226,23 @@
         <w:t xml:space="preserve"> </w:t>
       </w:r>
       <w:r>
-        <w:t xml:space="preserve">actual cubre menús y partida, pero aún no implementa la narrativa escape room del documento inicial. El</w:t>
+        <w:t xml:space="preserve">cubre menús y partida, incluido un</w:t>
+      </w:r>
+      <w:r>
+        <w:t xml:space="preserve"> </w:t>
+      </w:r>
+      <w:r>
+        <w:rPr>
+          <w:b/>
+          <w:bCs/>
+        </w:rPr>
+        <w:t xml:space="preserve">modo escape room</w:t>
+      </w:r>
+      <w:r>
+        <w:t xml:space="preserve"> </w:t>
+      </w:r>
+      <w:r>
+        <w:t xml:space="preserve">con salas, tienda y botín, pero sin la narrativa gráfica completa del documento inicial. El</w:t>
       </w:r>
       <w:r>
         <w:t xml:space="preserve"> </w:t>

</xml_diff>

<commit_message>
Refactorizar economía escape, pity con saldo y documentación del TFG.
Extraer economia_partida, objetos_partida y semillas; hard pity pospuesto sin saldo, semilla aleatoria por partida escape, emoji de botín en cartas y tienda que filtra bonificaciones no aplicables. Consolidar feedback y utilidades, actualizar memoria/changelogs y suite de 416 tests.

Co-authored-by: Cursor <cursoragent@cursor.com>
</commit_message>
<xml_diff>
--- a/Docs/Entrega/Memoria_TFG_latex.docx
+++ b/Docs/Entrega/Memoria_TFG_latex.docx
@@ -140,7 +140,10 @@
         <w:t xml:space="preserve">pygame</w:t>
       </w:r>
       <w:r>
-        <w:t xml:space="preserve">) descrito en esta memoria; la capa narrativa escape room completa queda como evolución futura del mismo proyecto.</w:t>
+        <w:t xml:space="preserve"> </w:t>
+      </w:r>
+      <w:r>
+        <w:t xml:space="preserve">con cinco modos, incluido escape room con mecánicas jugables) descrito en esta memoria; la capa narrativa gráfica completa queda como evolución futura del mismo proyecto.</w:t>
       </w:r>
     </w:p>
     <w:p>
@@ -3662,13 +3665,13 @@
                 <w:b/>
                 <w:bCs/>
               </w:rPr>
-              <w:t xml:space="preserve">395</w:t>
+              <w:t xml:space="preserve">424</w:t>
             </w:r>
             <w:r>
               <w:t xml:space="preserve"> </w:t>
             </w:r>
             <w:r>
-              <w:t xml:space="preserve">tests: 387 + 8 en</w:t>
+              <w:t xml:space="preserve">tests: 416 + 8 en</w:t>
             </w:r>
             <w:r>
               <w:t xml:space="preserve"> </w:t>
@@ -3781,6 +3784,41 @@
           </w:p>
         </w:tc>
       </w:tr>
+      <w:tr>
+        <w:tc>
+          <w:tcPr/>
+          <w:p>
+            <w:pPr>
+              <w:pStyle w:val="Compact"/>
+              <w:jc w:val="left"/>
+            </w:pPr>
+            <w:r>
+              <w:t xml:space="preserve">Análisis del sistema de pity</w:t>
+            </w:r>
+          </w:p>
+        </w:tc>
+        <w:tc>
+          <w:tcPr/>
+          <w:p>
+            <w:pPr>
+              <w:pStyle w:val="Compact"/>
+              <w:jc w:val="left"/>
+            </w:pPr>
+            <w:r>
+              <w:rPr>
+                <w:rStyle w:val="VerbatimChar"/>
+              </w:rPr>
+              <w:t xml:space="preserve">Files/simulacion_pity.py</w:t>
+            </w:r>
+            <w:r>
+              <w:t xml:space="preserve"> </w:t>
+            </w:r>
+            <w:r>
+              <w:t xml:space="preserve">(véase §5.8)</w:t>
+            </w:r>
+          </w:p>
+        </w:tc>
+      </w:tr>
     </w:tbl>
     <w:p>
       <w:pPr>
@@ -3912,7 +3950,7 @@
     </w:p>
     <w:bookmarkEnd w:id="64"/>
     <w:bookmarkEnd w:id="65"/>
-    <w:bookmarkStart w:id="87" w:name="resultados"/>
+    <w:bookmarkStart w:id="100" w:name="resultados"/>
     <w:p>
       <w:pPr>
         <w:pStyle w:val="Heading1"/>
@@ -4100,13 +4138,13 @@
           <w:b/>
           <w:bCs/>
         </w:rPr>
-        <w:t xml:space="preserve">1289</w:t>
-      </w:r>
-      <w:r>
-        <w:t xml:space="preserve"> </w:t>
-      </w:r>
-      <w:r>
-        <w:t xml:space="preserve">entradas.</w:t>
+        <w:t xml:space="preserve">1411</w:t>
+      </w:r>
+      <w:r>
+        <w:t xml:space="preserve"> </w:t>
+      </w:r>
+      <w:r>
+        <w:t xml:space="preserve">entradas (480 copias alineadas con el dataset).</w:t>
       </w:r>
     </w:p>
     <w:p>
@@ -5534,10 +5572,13 @@
         <w:rPr>
           <w:rStyle w:val="VerbatimChar"/>
         </w:rPr>
-        <w:t xml:space="preserve">utils_plantillas_core.py</w:t>
-      </w:r>
-      <w:r>
-        <w:t xml:space="preserve">, compartida con</w:t>
+        <w:t xml:space="preserve">Juego/Comun/utils_plantillas_core.py</w:t>
+      </w:r>
+      <w:r>
+        <w:t xml:space="preserve"> </w:t>
+      </w:r>
+      <w:r>
+        <w:t xml:space="preserve">(reexportada desde</w:t>
       </w:r>
       <w:r>
         <w:t xml:space="preserve"> </w:t>
@@ -5546,10 +5587,13 @@
         <w:rPr>
           <w:rStyle w:val="VerbatimChar"/>
         </w:rPr>
-        <w:t xml:space="preserve">Juego/Comun/datos.py</w:t>
-      </w:r>
-      <w:r>
-        <w:t xml:space="preserve">. Los datos del juego se organizan en</w:t>
+        <w:t xml:space="preserve">Files/</w:t>
+      </w:r>
+      <w:r>
+        <w:t xml:space="preserve"> </w:t>
+      </w:r>
+      <w:r>
+        <w:t xml:space="preserve">para los scripts de mantenimiento). Los datos del juego se organizan en</w:t>
       </w:r>
       <w:r>
         <w:t xml:space="preserve"> </w:t>
@@ -5601,7 +5645,7 @@
           <w:b/>
           <w:bCs/>
         </w:rPr>
-        <w:t xml:space="preserve">395</w:t>
+        <w:t xml:space="preserve">424</w:t>
       </w:r>
       <w:r>
         <w:t xml:space="preserve"> </w:t>
@@ -5819,7 +5863,7 @@
               <w:jc w:val="left"/>
             </w:pPr>
             <w:r>
-              <w:t xml:space="preserve">4</w:t>
+              <w:t xml:space="preserve">5</w:t>
             </w:r>
           </w:p>
         </w:tc>
@@ -5845,7 +5889,7 @@
               <w:jc w:val="left"/>
             </w:pPr>
             <w:r>
-              <w:t xml:space="preserve">395</w:t>
+              <w:t xml:space="preserve">424</w:t>
             </w:r>
           </w:p>
         </w:tc>
@@ -8255,41 +8299,22 @@
       </w:r>
     </w:p>
     <w:bookmarkEnd w:id="86"/>
-    <w:bookmarkEnd w:id="87"/>
-    <w:bookmarkStart w:id="94" w:name="discusión"/>
-    <w:p>
-      <w:pPr>
-        <w:pStyle w:val="Heading1"/>
+    <w:bookmarkStart w:id="99" w:name="análisis-del-sistema-de-pity"/>
+    <w:p>
+      <w:pPr>
+        <w:pStyle w:val="Heading2"/>
       </w:pPr>
       <w:r>
         <w:rPr>
           <w:rStyle w:val="SectionNumber"/>
         </w:rPr>
-        <w:t xml:space="preserve">6</w:t>
+        <w:t xml:space="preserve">5.8</w:t>
       </w:r>
       <w:r>
         <w:tab/>
       </w:r>
       <w:r>
-        <w:t xml:space="preserve">Discusión</w:t>
-      </w:r>
-    </w:p>
-    <w:bookmarkStart w:id="88" w:name="cumplimiento-de-los-objetivos"/>
-    <w:p>
-      <w:pPr>
-        <w:pStyle w:val="Heading2"/>
-      </w:pPr>
-      <w:r>
-        <w:rPr>
-          <w:rStyle w:val="SectionNumber"/>
-        </w:rPr>
-        <w:t xml:space="preserve">6.1</w:t>
-      </w:r>
-      <w:r>
-        <w:tab/>
-      </w:r>
-      <w:r>
-        <w:t xml:space="preserve">Cumplimiento de los objetivos</w:t>
+        <w:t xml:space="preserve">Análisis del sistema de pity</w:t>
       </w:r>
     </w:p>
     <w:p>
@@ -8297,7 +8322,65 @@
         <w:pStyle w:val="FirstParagraph"/>
       </w:pPr>
       <w:r>
-        <w:t xml:space="preserve">El</w:t>
+        <w:t xml:space="preserve">En los modos</w:t>
+      </w:r>
+      <w:r>
+        <w:t xml:space="preserve"> </w:t>
+      </w:r>
+      <w:r>
+        <w:rPr>
+          <w:i/>
+          <w:iCs/>
+        </w:rPr>
+        <w:t xml:space="preserve">escape room</w:t>
+      </w:r>
+      <w:r>
+        <w:t xml:space="preserve"> </w:t>
+      </w:r>
+      <w:r>
+        <w:t xml:space="preserve">y</w:t>
+      </w:r>
+      <w:r>
+        <w:t xml:space="preserve"> </w:t>
+      </w:r>
+      <w:r>
+        <w:rPr>
+          <w:i/>
+          <w:iCs/>
+        </w:rPr>
+        <w:t xml:space="preserve">resistencia</w:t>
+      </w:r>
+      <w:r>
+        <w:t xml:space="preserve">, ciertos eventos beneficiosos (puertas de descanso, tienda, botín u ofertas sí/no) se generan de forma aleatoria. Para evitar rachas largas sin recompensas —análogo al</w:t>
+      </w:r>
+      <w:r>
+        <w:t xml:space="preserve"> </w:t>
+      </w:r>
+      <w:r>
+        <w:rPr>
+          <w:i/>
+          <w:iCs/>
+        </w:rPr>
+        <w:t xml:space="preserve">pity</w:t>
+      </w:r>
+      <w:r>
+        <w:t xml:space="preserve"> </w:t>
+      </w:r>
+      <w:r>
+        <w:t xml:space="preserve">de los</w:t>
+      </w:r>
+      <w:r>
+        <w:t xml:space="preserve"> </w:t>
+      </w:r>
+      <w:r>
+        <w:rPr>
+          <w:i/>
+          <w:iCs/>
+        </w:rPr>
+        <w:t xml:space="preserve">gacha games</w:t>
+      </w:r>
+      <w:r>
+        <w:t xml:space="preserve">— el motor combina</w:t>
       </w:r>
       <w:r>
         <w:t xml:space="preserve"> </w:t>
@@ -8307,13 +8390,13 @@
           <w:b/>
           <w:bCs/>
         </w:rPr>
-        <w:t xml:space="preserve">objetivo general</w:t>
-      </w:r>
-      <w:r>
-        <w:t xml:space="preserve"> </w:t>
-      </w:r>
-      <w:r>
-        <w:t xml:space="preserve">se cumple de forma parcial: existe un juego educativo interactivo basado en contenidos del grado, con un</w:t>
+        <w:t xml:space="preserve">pity suave</w:t>
+      </w:r>
+      <w:r>
+        <w:t xml:space="preserve"> </w:t>
+      </w:r>
+      <w:r>
+        <w:t xml:space="preserve">(sube la probabilidad tras cada fallo) y</w:t>
       </w:r>
       <w:r>
         <w:t xml:space="preserve"> </w:t>
@@ -8323,13 +8406,278 @@
           <w:b/>
           <w:bCs/>
         </w:rPr>
-        <w:t xml:space="preserve">modo escape room</w:t>
-      </w:r>
-      <w:r>
-        <w:t xml:space="preserve"> </w:t>
-      </w:r>
-      <w:r>
-        <w:t xml:space="preserve">que estructura la partida en salas y puertas, aunque sin guion narrativo gráfico completo. La progresión actual es ludificada (vidas, puntos, dificultad creciente) y curricular (filtros por etapa del grado).</w:t>
+        <w:t xml:space="preserve">hard pity</w:t>
+      </w:r>
+      <w:r>
+        <w:t xml:space="preserve"> </w:t>
+      </w:r>
+      <w:r>
+        <w:t xml:space="preserve">(garantía en un umbral).</w:t>
+      </w:r>
+    </w:p>
+    <w:p>
+      <w:pPr>
+        <w:pStyle w:val="BodyText"/>
+      </w:pPr>
+      <w:r>
+        <w:t xml:space="preserve">Sea</w:t>
+      </w:r>
+      <w:r>
+        <w:t xml:space="preserve"> </w:t>
+      </w:r>
+      <m:oMath>
+        <m:r>
+          <m:t>s</m:t>
+        </m:r>
+      </m:oMath>
+      <w:r>
+        <w:t xml:space="preserve"> </w:t>
+      </w:r>
+      <w:r>
+        <w:t xml:space="preserve">el número de salas consecutivas sin haber visto el evento. La probabilidad en el siguiente intento es</w:t>
+      </w:r>
+    </w:p>
+    <w:p>
+      <w:pPr>
+        <w:pStyle w:val="BodyText"/>
+      </w:pPr>
+      <m:oMathPara>
+        <m:oMathParaPr>
+          <m:jc m:val="center"/>
+        </m:oMathParaPr>
+        <m:oMath>
+          <m:sSub>
+            <m:e>
+              <m:r>
+                <m:t>p</m:t>
+              </m:r>
+            </m:e>
+            <m:sub>
+              <m:r>
+                <m:t>s</m:t>
+              </m:r>
+            </m:sub>
+          </m:sSub>
+          <m:r>
+            <m:rPr>
+              <m:sty m:val="p"/>
+            </m:rPr>
+            <m:t>=</m:t>
+          </m:r>
+          <m:r>
+            <m:rPr>
+              <m:sty m:val="p"/>
+            </m:rPr>
+            <m:t>min</m:t>
+          </m:r>
+          <m:d>
+            <m:dPr>
+              <m:begChr m:val="("/>
+              <m:sepChr m:val=""/>
+              <m:endChr m:val=")"/>
+              <m:grow/>
+            </m:dPr>
+            <m:e>
+              <m:sSub>
+                <m:e>
+                  <m:r>
+                    <m:t>p</m:t>
+                  </m:r>
+                </m:e>
+                <m:sub>
+                  <m:r>
+                    <m:rPr>
+                      <m:sty m:val="p"/>
+                    </m:rPr>
+                    <m:t>max</m:t>
+                  </m:r>
+                </m:sub>
+              </m:sSub>
+              <m:r>
+                <m:rPr>
+                  <m:sty m:val="p"/>
+                </m:rPr>
+                <m:t>,</m:t>
+              </m:r>
+              <m:r>
+                <m:t> </m:t>
+              </m:r>
+              <m:sSub>
+                <m:e>
+                  <m:r>
+                    <m:t>p</m:t>
+                  </m:r>
+                </m:e>
+                <m:sub>
+                  <m:r>
+                    <m:t>0</m:t>
+                  </m:r>
+                </m:sub>
+              </m:sSub>
+              <m:r>
+                <m:rPr>
+                  <m:sty m:val="p"/>
+                </m:rPr>
+                <m:t>+</m:t>
+              </m:r>
+              <m:r>
+                <m:t>s</m:t>
+              </m:r>
+              <m:r>
+                <m:t> </m:t>
+              </m:r>
+              <m:r>
+                <m:t>δ</m:t>
+              </m:r>
+            </m:e>
+          </m:d>
+          <m:r>
+            <m:rPr>
+              <m:sty m:val="p"/>
+            </m:rPr>
+            <m:t>,</m:t>
+          </m:r>
+        </m:oMath>
+      </m:oMathPara>
+    </w:p>
+    <w:p>
+      <w:pPr>
+        <w:pStyle w:val="FirstParagraph"/>
+      </w:pPr>
+      <w:r>
+        <w:t xml:space="preserve">con</w:t>
+      </w:r>
+      <w:r>
+        <w:t xml:space="preserve"> </w:t>
+      </w:r>
+      <m:oMath>
+        <m:sSub>
+          <m:e>
+            <m:r>
+              <m:t>p</m:t>
+            </m:r>
+          </m:e>
+          <m:sub>
+            <m:r>
+              <m:t>0</m:t>
+            </m:r>
+          </m:sub>
+        </m:sSub>
+      </m:oMath>
+      <w:r>
+        <w:t xml:space="preserve"> </w:t>
+      </w:r>
+      <w:r>
+        <w:t xml:space="preserve">probabilidad base,</w:t>
+      </w:r>
+      <w:r>
+        <w:t xml:space="preserve"> </w:t>
+      </w:r>
+      <m:oMath>
+        <m:r>
+          <m:t>δ</m:t>
+        </m:r>
+      </m:oMath>
+      <w:r>
+        <w:t xml:space="preserve"> </w:t>
+      </w:r>
+      <w:r>
+        <w:t xml:space="preserve">incremento por racha y</w:t>
+      </w:r>
+      <w:r>
+        <w:t xml:space="preserve"> </w:t>
+      </w:r>
+      <m:oMath>
+        <m:sSub>
+          <m:e>
+            <m:r>
+              <m:t>p</m:t>
+            </m:r>
+          </m:e>
+          <m:sub>
+            <m:r>
+              <m:rPr>
+                <m:sty m:val="p"/>
+              </m:rPr>
+              <m:t>max</m:t>
+            </m:r>
+          </m:sub>
+        </m:sSub>
+      </m:oMath>
+      <w:r>
+        <w:t xml:space="preserve"> </w:t>
+      </w:r>
+      <w:r>
+        <w:t xml:space="preserve">techo (</w:t>
+      </w:r>
+      <m:oMath>
+        <m:r>
+          <m:t>0</m:t>
+        </m:r>
+        <m:r>
+          <m:rPr>
+            <m:sty m:val="p"/>
+          </m:rPr>
+          <m:t>,</m:t>
+        </m:r>
+        <m:r>
+          <m:t>48</m:t>
+        </m:r>
+      </m:oMath>
+      <w:r>
+        <w:t xml:space="preserve"> </w:t>
+      </w:r>
+      <w:r>
+        <w:t xml:space="preserve">en escape room). Tras un acierto,</w:t>
+      </w:r>
+      <w:r>
+        <w:t xml:space="preserve"> </w:t>
+      </w:r>
+      <m:oMath>
+        <m:r>
+          <m:t>s</m:t>
+        </m:r>
+        <m:r>
+          <m:rPr>
+            <m:sty m:val="p"/>
+          </m:rPr>
+          <m:t>←</m:t>
+        </m:r>
+        <m:r>
+          <m:t>0</m:t>
+        </m:r>
+      </m:oMath>
+      <w:r>
+        <w:t xml:space="preserve">; si no sale,</w:t>
+      </w:r>
+      <w:r>
+        <w:t xml:space="preserve"> </w:t>
+      </w:r>
+      <m:oMath>
+        <m:r>
+          <m:t>s</m:t>
+        </m:r>
+        <m:r>
+          <m:rPr>
+            <m:sty m:val="p"/>
+          </m:rPr>
+          <m:t>←</m:t>
+        </m:r>
+        <m:r>
+          <m:t>s</m:t>
+        </m:r>
+        <m:r>
+          <m:rPr>
+            <m:sty m:val="p"/>
+          </m:rPr>
+          <m:t>+</m:t>
+        </m:r>
+        <m:r>
+          <m:t>1</m:t>
+        </m:r>
+      </m:oMath>
+      <w:r>
+        <w:t xml:space="preserve">.</w:t>
       </w:r>
     </w:p>
     <w:tbl>
@@ -8360,6 +8708,719 @@
                 <w:b/>
                 <w:bCs/>
               </w:rPr>
+              <w:t xml:space="preserve">Evento</w:t>
+            </w:r>
+          </w:p>
+        </w:tc>
+        <w:tc>
+          <w:tcPr/>
+          <w:p>
+            <w:pPr>
+              <w:pStyle w:val="Compact"/>
+              <w:jc w:val="left"/>
+            </w:pPr>
+            <m:oMath>
+              <m:sSub>
+                <m:e>
+                  <m:r>
+                    <m:t>p</m:t>
+                  </m:r>
+                </m:e>
+                <m:sub>
+                  <m:r>
+                    <m:t>0</m:t>
+                  </m:r>
+                </m:sub>
+              </m:sSub>
+            </m:oMath>
+            <w:r>
+              <w:t xml:space="preserve">​</w:t>
+            </w:r>
+          </w:p>
+        </w:tc>
+        <w:tc>
+          <w:tcPr/>
+          <w:p>
+            <w:pPr>
+              <w:pStyle w:val="Compact"/>
+              <w:jc w:val="left"/>
+            </w:pPr>
+            <m:oMath>
+              <m:r>
+                <m:t>δ</m:t>
+              </m:r>
+            </m:oMath>
+            <w:r>
+              <w:t xml:space="preserve">​</w:t>
+            </w:r>
+          </w:p>
+        </w:tc>
+        <w:tc>
+          <w:tcPr/>
+          <w:p>
+            <w:pPr>
+              <w:pStyle w:val="Compact"/>
+              <w:jc w:val="left"/>
+            </w:pPr>
+            <w:r>
+              <w:rPr>
+                <w:b/>
+                <w:bCs/>
+              </w:rPr>
+              <w:t xml:space="preserve">Hard pity (sala)</w:t>
+            </w:r>
+          </w:p>
+        </w:tc>
+      </w:tr>
+      <w:tr>
+        <w:tc>
+          <w:tcPr/>
+          <w:p>
+            <w:pPr>
+              <w:pStyle w:val="Compact"/>
+              <w:jc w:val="left"/>
+            </w:pPr>
+            <w:r>
+              <w:t xml:space="preserve">Descanso</w:t>
+            </w:r>
+          </w:p>
+        </w:tc>
+        <w:tc>
+          <w:tcPr/>
+          <w:p>
+            <w:pPr>
+              <w:pStyle w:val="Compact"/>
+              <w:jc w:val="left"/>
+            </w:pPr>
+            <w:r>
+              <w:t xml:space="preserve">0,06</w:t>
+            </w:r>
+          </w:p>
+        </w:tc>
+        <w:tc>
+          <w:tcPr/>
+          <w:p>
+            <w:pPr>
+              <w:pStyle w:val="Compact"/>
+              <w:jc w:val="left"/>
+            </w:pPr>
+            <w:r>
+              <w:t xml:space="preserve">0,04</w:t>
+            </w:r>
+          </w:p>
+        </w:tc>
+        <w:tc>
+          <w:tcPr/>
+          <w:p>
+            <w:pPr>
+              <w:pStyle w:val="Compact"/>
+              <w:jc w:val="left"/>
+            </w:pPr>
+            <w:r>
+              <w:t xml:space="preserve">5</w:t>
+            </w:r>
+          </w:p>
+        </w:tc>
+      </w:tr>
+      <w:tr>
+        <w:tc>
+          <w:tcPr/>
+          <w:p>
+            <w:pPr>
+              <w:pStyle w:val="Compact"/>
+              <w:jc w:val="left"/>
+            </w:pPr>
+            <w:r>
+              <w:t xml:space="preserve">Tienda</w:t>
+            </w:r>
+          </w:p>
+        </w:tc>
+        <w:tc>
+          <w:tcPr/>
+          <w:p>
+            <w:pPr>
+              <w:pStyle w:val="Compact"/>
+              <w:jc w:val="left"/>
+            </w:pPr>
+            <w:r>
+              <w:t xml:space="preserve">0,03</w:t>
+            </w:r>
+          </w:p>
+        </w:tc>
+        <w:tc>
+          <w:tcPr/>
+          <w:p>
+            <w:pPr>
+              <w:pStyle w:val="Compact"/>
+              <w:jc w:val="left"/>
+            </w:pPr>
+            <w:r>
+              <w:t xml:space="preserve">0,05</w:t>
+            </w:r>
+          </w:p>
+        </w:tc>
+        <w:tc>
+          <w:tcPr/>
+          <w:p>
+            <w:pPr>
+              <w:pStyle w:val="Compact"/>
+              <w:jc w:val="left"/>
+            </w:pPr>
+            <w:r>
+              <w:t xml:space="preserve">10</w:t>
+            </w:r>
+          </w:p>
+        </w:tc>
+      </w:tr>
+      <w:tr>
+        <w:tc>
+          <w:tcPr/>
+          <w:p>
+            <w:pPr>
+              <w:pStyle w:val="Compact"/>
+              <w:jc w:val="left"/>
+            </w:pPr>
+            <w:r>
+              <w:t xml:space="preserve">Botín (puerta normal)</w:t>
+            </w:r>
+          </w:p>
+        </w:tc>
+        <w:tc>
+          <w:tcPr/>
+          <w:p>
+            <w:pPr>
+              <w:pStyle w:val="Compact"/>
+              <w:jc w:val="left"/>
+            </w:pPr>
+            <w:r>
+              <w:t xml:space="preserve">—</w:t>
+            </w:r>
+          </w:p>
+        </w:tc>
+        <w:tc>
+          <w:tcPr/>
+          <w:p>
+            <w:pPr>
+              <w:pStyle w:val="Compact"/>
+              <w:jc w:val="left"/>
+            </w:pPr>
+            <w:r>
+              <w:t xml:space="preserve">—</w:t>
+            </w:r>
+          </w:p>
+        </w:tc>
+        <w:tc>
+          <w:tcPr/>
+          <w:p>
+            <w:pPr>
+              <w:pStyle w:val="Compact"/>
+              <w:jc w:val="left"/>
+            </w:pPr>
+            <w:r>
+              <w:t xml:space="preserve">cada 3 salas</w:t>
+            </w:r>
+          </w:p>
+        </w:tc>
+      </w:tr>
+    </w:tbl>
+    <w:p>
+      <w:pPr>
+        <w:pStyle w:val="BodyText"/>
+      </w:pPr>
+      <w:r>
+        <w:t xml:space="preserve">Sin pity (</w:t>
+      </w:r>
+      <m:oMath>
+        <m:r>
+          <m:t>δ</m:t>
+        </m:r>
+        <m:r>
+          <m:rPr>
+            <m:sty m:val="p"/>
+          </m:rPr>
+          <m:t>=</m:t>
+        </m:r>
+        <m:r>
+          <m:t>0</m:t>
+        </m:r>
+      </m:oMath>
+      <w:r>
+        <w:t xml:space="preserve">), la probabilidad de no ver descanso en</w:t>
+      </w:r>
+      <w:r>
+        <w:t xml:space="preserve"> </w:t>
+      </w:r>
+      <m:oMath>
+        <m:r>
+          <m:t>n</m:t>
+        </m:r>
+        <m:r>
+          <m:rPr>
+            <m:sty m:val="p"/>
+          </m:rPr>
+          <m:t>=</m:t>
+        </m:r>
+        <m:r>
+          <m:t>30</m:t>
+        </m:r>
+      </m:oMath>
+      <w:r>
+        <w:t xml:space="preserve"> </w:t>
+      </w:r>
+      <w:r>
+        <w:t xml:space="preserve">salas es</w:t>
+      </w:r>
+      <w:r>
+        <w:t xml:space="preserve"> </w:t>
+      </w:r>
+      <m:oMath>
+        <m:r>
+          <m:rPr>
+            <m:sty m:val="p"/>
+          </m:rPr>
+          <m:t>(</m:t>
+        </m:r>
+        <m:r>
+          <m:t>1</m:t>
+        </m:r>
+        <m:r>
+          <m:rPr>
+            <m:sty m:val="p"/>
+          </m:rPr>
+          <m:t>−</m:t>
+        </m:r>
+        <m:sSub>
+          <m:e>
+            <m:r>
+              <m:t>p</m:t>
+            </m:r>
+          </m:e>
+          <m:sub>
+            <m:r>
+              <m:t>0</m:t>
+            </m:r>
+          </m:sub>
+        </m:sSub>
+        <m:sSup>
+          <m:e>
+            <m:r>
+              <m:rPr>
+                <m:sty m:val="p"/>
+              </m:rPr>
+              <m:t>)</m:t>
+            </m:r>
+          </m:e>
+          <m:sup>
+            <m:r>
+              <m:t>n</m:t>
+            </m:r>
+          </m:sup>
+        </m:sSup>
+        <m:r>
+          <m:rPr>
+            <m:sty m:val="p"/>
+          </m:rPr>
+          <m:t>≈</m:t>
+        </m:r>
+        <m:r>
+          <m:t>15</m:t>
+        </m:r>
+        <m:r>
+          <m:rPr>
+            <m:sty m:val="p"/>
+          </m:rPr>
+          <m:t>,</m:t>
+        </m:r>
+        <m:r>
+          <m:t>6</m:t>
+        </m:r>
+        <m:r>
+          <m:t> </m:t>
+        </m:r>
+        <m:r>
+          <m:rPr>
+            <m:sty m:val="p"/>
+          </m:rPr>
+          <m:t>%</m:t>
+        </m:r>
+      </m:oMath>
+      <w:r>
+        <w:t xml:space="preserve">; la racha p95 sin evento alcanza 29 salas (10 000 réplicas). Con pity suave + hard pity en la sala 5, ninguna réplica termina sin descanso; la racha p95 queda en 4 salas y la sala media del primer descanso es</w:t>
+      </w:r>
+      <w:r>
+        <w:t xml:space="preserve"> </w:t>
+      </w:r>
+      <w:r>
+        <w:rPr>
+          <w:b/>
+          <w:bCs/>
+        </w:rPr>
+        <w:t xml:space="preserve">4,13</w:t>
+      </w:r>
+      <w:r>
+        <w:t xml:space="preserve"> </w:t>
+      </w:r>
+      <w:r>
+        <w:t xml:space="preserve">(figuras </w:t>
+      </w:r>
+      <w:hyperlink w:anchor="fig:pity-curva">
+        <w:r>
+          <w:rPr>
+            <w:rStyle w:val="Hyperlink"/>
+          </w:rPr>
+          <w:t xml:space="preserve">5</w:t>
+        </w:r>
+      </w:hyperlink>
+      <w:r>
+        <w:t xml:space="preserve">–</w:t>
+      </w:r>
+      <w:hyperlink w:anchor="fig:pity-dist">
+        <w:r>
+          <w:rPr>
+            <w:rStyle w:val="Hyperlink"/>
+          </w:rPr>
+          <w:t xml:space="preserve">7</w:t>
+        </w:r>
+      </w:hyperlink>
+      <w:r>
+        <w:t xml:space="preserve">).</w:t>
+      </w:r>
+    </w:p>
+    <w:bookmarkStart w:id="90" w:name="fig:pity-curva"/>
+    <w:p>
+      <w:pPr>
+        <w:pStyle w:val="CaptionedFigure"/>
+      </w:pPr>
+      <w:r>
+        <w:drawing>
+          <wp:inline>
+            <wp:extent cx="4907280" cy="2826454"/>
+            <wp:effectExtent b="0" l="0" r="0" t="0"/>
+            <wp:docPr descr="" title="" id="88" name="Picture"/>
+            <a:graphic>
+              <a:graphicData uri="http://schemas.openxmlformats.org/drawingml/2006/picture">
+                <pic:pic>
+                  <pic:nvPicPr>
+                    <pic:cNvPr descr="pity_curva_probabilidad.png" id="89" name="Picture"/>
+                    <pic:cNvPicPr>
+                      <a:picLocks noChangeArrowheads="1" noChangeAspect="1"/>
+                    </pic:cNvPicPr>
+                  </pic:nvPicPr>
+                  <pic:blipFill>
+                    <a:blip r:embed="rId87"/>
+                    <a:stretch>
+                      <a:fillRect/>
+                    </a:stretch>
+                  </pic:blipFill>
+                  <pic:spPr bwMode="auto">
+                    <a:xfrm>
+                      <a:off x="0" y="0"/>
+                      <a:ext cx="4907280" cy="2826454"/>
+                    </a:xfrm>
+                    <a:prstGeom prst="rect">
+                      <a:avLst/>
+                    </a:prstGeom>
+                    <a:noFill/>
+                    <a:ln w="9525">
+                      <a:noFill/>
+                      <a:headEnd/>
+                      <a:tailEnd/>
+                    </a:ln>
+                  </pic:spPr>
+                </pic:pic>
+              </a:graphicData>
+            </a:graphic>
+          </wp:inline>
+        </w:drawing>
+      </w:r>
+    </w:p>
+    <w:p>
+      <w:pPr>
+        <w:pStyle w:val="ImageCaption"/>
+      </w:pPr>
+      <w:r>
+        <w:t xml:space="preserve">Curva</w:t>
+      </w:r>
+      <w:r>
+        <w:t xml:space="preserve"> </w:t>
+      </w:r>
+      <m:oMath>
+        <m:sSub>
+          <m:e>
+            <m:r>
+              <m:t>p</m:t>
+            </m:r>
+          </m:e>
+          <m:sub>
+            <m:r>
+              <m:t>s</m:t>
+            </m:r>
+          </m:sub>
+        </m:sSub>
+      </m:oMath>
+      <w:r>
+        <w:t xml:space="preserve"> </w:t>
+      </w:r>
+      <w:r>
+        <w:t xml:space="preserve">para descanso y tienda en escape room.</w:t>
+      </w:r>
+    </w:p>
+    <w:bookmarkEnd w:id="90"/>
+    <w:bookmarkStart w:id="94" w:name="fig:pity-comp"/>
+    <w:p>
+      <w:pPr>
+        <w:pStyle w:val="CaptionedFigure"/>
+      </w:pPr>
+      <w:r>
+        <w:drawing>
+          <wp:inline>
+            <wp:extent cx="4693920" cy="2918946"/>
+            <wp:effectExtent b="0" l="0" r="0" t="0"/>
+            <wp:docPr descr="" title="" id="92" name="Picture"/>
+            <a:graphic>
+              <a:graphicData uri="http://schemas.openxmlformats.org/drawingml/2006/picture">
+                <pic:pic>
+                  <pic:nvPicPr>
+                    <pic:cNvPr descr="pity_comparacion_descanso.png" id="93" name="Picture"/>
+                    <pic:cNvPicPr>
+                      <a:picLocks noChangeArrowheads="1" noChangeAspect="1"/>
+                    </pic:cNvPicPr>
+                  </pic:nvPicPr>
+                  <pic:blipFill>
+                    <a:blip r:embed="rId91"/>
+                    <a:stretch>
+                      <a:fillRect/>
+                    </a:stretch>
+                  </pic:blipFill>
+                  <pic:spPr bwMode="auto">
+                    <a:xfrm>
+                      <a:off x="0" y="0"/>
+                      <a:ext cx="4693920" cy="2918946"/>
+                    </a:xfrm>
+                    <a:prstGeom prst="rect">
+                      <a:avLst/>
+                    </a:prstGeom>
+                    <a:noFill/>
+                    <a:ln w="9525">
+                      <a:noFill/>
+                      <a:headEnd/>
+                      <a:tailEnd/>
+                    </a:ln>
+                  </pic:spPr>
+                </pic:pic>
+              </a:graphicData>
+            </a:graphic>
+          </wp:inline>
+        </w:drawing>
+      </w:r>
+    </w:p>
+    <w:p>
+      <w:pPr>
+        <w:pStyle w:val="ImageCaption"/>
+      </w:pPr>
+      <w:r>
+        <w:t xml:space="preserve">Modelo simplificado (10 000 réplicas): comparación con y sin pity.</w:t>
+      </w:r>
+    </w:p>
+    <w:bookmarkEnd w:id="94"/>
+    <w:bookmarkStart w:id="98" w:name="fig:pity-dist"/>
+    <w:p>
+      <w:pPr>
+        <w:pStyle w:val="CaptionedFigure"/>
+      </w:pPr>
+      <w:r>
+        <w:drawing>
+          <wp:inline>
+            <wp:extent cx="4907280" cy="2823426"/>
+            <wp:effectExtent b="0" l="0" r="0" t="0"/>
+            <wp:docPr descr="" title="" id="96" name="Picture"/>
+            <a:graphic>
+              <a:graphicData uri="http://schemas.openxmlformats.org/drawingml/2006/picture">
+                <pic:pic>
+                  <pic:nvPicPr>
+                    <pic:cNvPr descr="pity_distribucion_primer_descanso.png" id="97" name="Picture"/>
+                    <pic:cNvPicPr>
+                      <a:picLocks noChangeArrowheads="1" noChangeAspect="1"/>
+                    </pic:cNvPicPr>
+                  </pic:nvPicPr>
+                  <pic:blipFill>
+                    <a:blip r:embed="rId95"/>
+                    <a:stretch>
+                      <a:fillRect/>
+                    </a:stretch>
+                  </pic:blipFill>
+                  <pic:spPr bwMode="auto">
+                    <a:xfrm>
+                      <a:off x="0" y="0"/>
+                      <a:ext cx="4907280" cy="2823426"/>
+                    </a:xfrm>
+                    <a:prstGeom prst="rect">
+                      <a:avLst/>
+                    </a:prstGeom>
+                    <a:noFill/>
+                    <a:ln w="9525">
+                      <a:noFill/>
+                      <a:headEnd/>
+                      <a:tailEnd/>
+                    </a:ln>
+                  </pic:spPr>
+                </pic:pic>
+              </a:graphicData>
+            </a:graphic>
+          </wp:inline>
+        </w:drawing>
+      </w:r>
+    </w:p>
+    <w:p>
+      <w:pPr>
+        <w:pStyle w:val="ImageCaption"/>
+      </w:pPr>
+      <w:r>
+        <w:t xml:space="preserve">Distribución de la sala del primer descanso (modelo con pity).</w:t>
+      </w:r>
+    </w:p>
+    <w:bookmarkEnd w:id="98"/>
+    <w:p>
+      <w:pPr>
+        <w:pStyle w:val="BodyText"/>
+      </w:pPr>
+      <w:r>
+        <w:t xml:space="preserve">El script</w:t>
+      </w:r>
+      <w:r>
+        <w:t xml:space="preserve"> </w:t>
+      </w:r>
+      <w:r>
+        <w:rPr>
+          <w:rStyle w:val="VerbatimChar"/>
+        </w:rPr>
+        <w:t xml:space="preserve">Files/simulacion_pity.py</w:t>
+      </w:r>
+      <w:r>
+        <w:t xml:space="preserve"> </w:t>
+      </w:r>
+      <w:r>
+        <w:t xml:space="preserve">reproduce el modelo; las figuras se generan con</w:t>
+      </w:r>
+      <w:r>
+        <w:t xml:space="preserve"> </w:t>
+      </w:r>
+      <w:r>
+        <w:rPr>
+          <w:rStyle w:val="VerbatimChar"/>
+        </w:rPr>
+        <w:t xml:space="preserve">python Docs/generar_figuras_memoria.py</w:t>
+      </w:r>
+      <w:r>
+        <w:t xml:space="preserve">.</w:t>
+      </w:r>
+    </w:p>
+    <w:bookmarkEnd w:id="99"/>
+    <w:bookmarkEnd w:id="100"/>
+    <w:bookmarkStart w:id="107" w:name="discusión"/>
+    <w:p>
+      <w:pPr>
+        <w:pStyle w:val="Heading1"/>
+      </w:pPr>
+      <w:r>
+        <w:rPr>
+          <w:rStyle w:val="SectionNumber"/>
+        </w:rPr>
+        <w:t xml:space="preserve">6</w:t>
+      </w:r>
+      <w:r>
+        <w:tab/>
+      </w:r>
+      <w:r>
+        <w:t xml:space="preserve">Discusión</w:t>
+      </w:r>
+    </w:p>
+    <w:bookmarkStart w:id="101" w:name="cumplimiento-de-los-objetivos"/>
+    <w:p>
+      <w:pPr>
+        <w:pStyle w:val="Heading2"/>
+      </w:pPr>
+      <w:r>
+        <w:rPr>
+          <w:rStyle w:val="SectionNumber"/>
+        </w:rPr>
+        <w:t xml:space="preserve">6.1</w:t>
+      </w:r>
+      <w:r>
+        <w:tab/>
+      </w:r>
+      <w:r>
+        <w:t xml:space="preserve">Cumplimiento de los objetivos</w:t>
+      </w:r>
+    </w:p>
+    <w:p>
+      <w:pPr>
+        <w:pStyle w:val="FirstParagraph"/>
+      </w:pPr>
+      <w:r>
+        <w:t xml:space="preserve">El</w:t>
+      </w:r>
+      <w:r>
+        <w:t xml:space="preserve"> </w:t>
+      </w:r>
+      <w:r>
+        <w:rPr>
+          <w:b/>
+          <w:bCs/>
+        </w:rPr>
+        <w:t xml:space="preserve">objetivo general</w:t>
+      </w:r>
+      <w:r>
+        <w:t xml:space="preserve"> </w:t>
+      </w:r>
+      <w:r>
+        <w:t xml:space="preserve">se cumple de forma parcial: existe un juego educativo interactivo basado en contenidos del grado, con un</w:t>
+      </w:r>
+      <w:r>
+        <w:t xml:space="preserve"> </w:t>
+      </w:r>
+      <w:r>
+        <w:rPr>
+          <w:b/>
+          <w:bCs/>
+        </w:rPr>
+        <w:t xml:space="preserve">modo escape room</w:t>
+      </w:r>
+      <w:r>
+        <w:t xml:space="preserve"> </w:t>
+      </w:r>
+      <w:r>
+        <w:t xml:space="preserve">que estructura la partida en salas y puertas, aunque sin guion narrativo gráfico completo. La progresión actual es ludificada (vidas, puntos, dificultad creciente) y curricular (filtros por etapa del grado).</w:t>
+      </w:r>
+    </w:p>
+    <w:tbl>
+      <w:tblPr>
+        <w:tblStyle w:val="Table"/>
+        <w:tblW w:type="auto" w:w="0"/>
+        <w:tblLook w:firstRow="1" w:lastRow="0" w:firstColumn="0" w:lastColumn="0" w:noHBand="0" w:noVBand="0" w:val="0020"/>
+      </w:tblPr>
+      <w:tblGrid>
+        <w:gridCol w:w="1980"/>
+        <w:gridCol w:w="1980"/>
+        <w:gridCol w:w="1980"/>
+        <w:gridCol w:w="1980"/>
+      </w:tblGrid>
+      <w:tr>
+        <w:trPr>
+          <w:tblHeader w:val="on"/>
+        </w:trPr>
+        <w:tc>
+          <w:tcPr/>
+          <w:p>
+            <w:pPr>
+              <w:pStyle w:val="Compact"/>
+              <w:jc w:val="left"/>
+            </w:pPr>
+            <w:r>
+              <w:rPr>
+                <w:b/>
+                <w:bCs/>
+              </w:rPr>
               <w:t xml:space="preserve">#</w:t>
             </w:r>
           </w:p>
@@ -8683,7 +9744,7 @@
               <w:jc w:val="left"/>
             </w:pPr>
             <w:r>
-              <w:t xml:space="preserve">Banco validado, 395 tests + CI; sin estudio con usuarios</w:t>
+              <w:t xml:space="preserve">Banco validado, 424 tests + CI; sin estudio con usuarios</w:t>
             </w:r>
           </w:p>
         </w:tc>
@@ -8713,8 +9774,8 @@
         <w:t xml:space="preserve">OE2, OE3, OE4 y OE5 están cubiertos en la versión pygame. OE1 (narrativa gráfica completa) queda parcialmente cubierto por las mecánicas del escape room y como trabajo futuro en arte y guion. El enfoque incremental —primero validar el núcleo evaluable, después la capa visual— permitió concentrar el esfuerzo en un único lanzador mantenible.</w:t>
       </w:r>
     </w:p>
-    <w:bookmarkEnd w:id="88"/>
-    <w:bookmarkStart w:id="89" w:name="validez-del-banco-de-preguntas"/>
+    <w:bookmarkEnd w:id="101"/>
+    <w:bookmarkStart w:id="102" w:name="validez-del-banco-de-preguntas"/>
     <w:p>
       <w:pPr>
         <w:pStyle w:val="Heading2"/>
@@ -8982,8 +10043,8 @@
         <w:t xml:space="preserve">propuestos para futuras versiones del esquema (§6.6).</w:t>
       </w:r>
     </w:p>
-    <w:bookmarkEnd w:id="89"/>
-    <w:bookmarkStart w:id="90" w:name="utilidad-formativa"/>
+    <w:bookmarkEnd w:id="102"/>
+    <w:bookmarkStart w:id="103" w:name="utilidad-formativa"/>
     <w:p>
       <w:pPr>
         <w:pStyle w:val="Heading2"/>
@@ -9098,8 +10159,8 @@
         <w:t xml:space="preserve">).</w:t>
       </w:r>
     </w:p>
-    <w:bookmarkEnd w:id="90"/>
-    <w:bookmarkStart w:id="91" w:name="relación-con-las-hipótesis"/>
+    <w:bookmarkEnd w:id="103"/>
+    <w:bookmarkStart w:id="104" w:name="relación-con-las-hipótesis"/>
     <w:p>
       <w:pPr>
         <w:pStyle w:val="Heading2"/>
@@ -9170,11 +10231,11 @@
         <w:t xml:space="preserve"> </w:t>
       </w:r>
       <w:r>
-        <w:t xml:space="preserve">encuentra respaldo en el modo historia y en el análisis del histórico institucional (8818 registros), desarrollado en la sección 5.6. La simulación Monte Carlo de la sección 5.7 complementa estas hipótesis al verificar cuantitativamente que el motor de evaluación no concede aprobación al azar.</w:t>
-      </w:r>
-    </w:p>
-    <w:bookmarkEnd w:id="91"/>
-    <w:bookmarkStart w:id="92" w:name="limitaciones-del-estudio"/>
+        <w:t xml:space="preserve">encuentra respaldo en el modo historia y en el análisis del histórico institucional (8818 registros), desarrollado en la sección 5.6. La simulación Monte Carlo de la sección 5.7 complementa estas hipótesis al verificar cuantitativamente que el motor de evaluación no concede aprobación al azar. El análisis del pity (§5.8) documenta el diseño probabilístico de la gamificación en modos prolongados.</w:t>
+      </w:r>
+    </w:p>
+    <w:bookmarkEnd w:id="104"/>
+    <w:bookmarkStart w:id="105" w:name="limitaciones-del-estudio"/>
     <w:p>
       <w:pPr>
         <w:pStyle w:val="Heading2"/>
@@ -9293,8 +10354,8 @@
         <w:t xml:space="preserve">amplía el pool con plantillas no revisadas y debe distinguirse del banco de producción en cualquier evaluación formal.</w:t>
       </w:r>
     </w:p>
-    <w:bookmarkEnd w:id="92"/>
-    <w:bookmarkStart w:id="93" w:name="trabajo-futuro"/>
+    <w:bookmarkEnd w:id="105"/>
+    <w:bookmarkStart w:id="106" w:name="trabajo-futuro"/>
     <w:p>
       <w:pPr>
         <w:pStyle w:val="Heading2"/>
@@ -9347,7 +10408,7 @@
         <w:t xml:space="preserve"> </w:t>
       </w:r>
       <w:r>
-        <w:t xml:space="preserve">en el CSV y en los filtros del juego, el desarrollo de la capa gráfica escape room o novela gráfica, y un piloto con usuarios (n</w:t>
+        <w:t xml:space="preserve">en el CSV y en los filtros del juego, el desarrollo de la narrativa gráfica completa del escape room, y un piloto con usuarios (n</w:t>
       </w:r>
       <w:r>
         <w:t xml:space="preserve"> </w:t>
@@ -9367,9 +10428,9 @@
         <w:t xml:space="preserve">15–20, cuestionario SUS, tiempo de práctica) para contrastar si las mecánicas de juego aumentan la práctica respecto a un listado estático —línea no formulada como hipótesis contrastada en este TFG por ausencia de datos. La integración con plataformas institucionales (Moodle, AulaWeb) completaría el despliegue en el grado.</w:t>
       </w:r>
     </w:p>
-    <w:bookmarkEnd w:id="93"/>
-    <w:bookmarkEnd w:id="94"/>
-    <w:bookmarkStart w:id="95" w:name="conclusiones"/>
+    <w:bookmarkEnd w:id="106"/>
+    <w:bookmarkEnd w:id="107"/>
+    <w:bookmarkStart w:id="108" w:name="conclusiones"/>
     <w:p>
       <w:pPr>
         <w:pStyle w:val="Heading1"/>
@@ -9462,7 +10523,7 @@
         <w:t xml:space="preserve"> </w:t>
       </w:r>
       <w:r>
-        <w:t xml:space="preserve">en pygame con modos libre, historia, resistencia y feedback que gamifica la autoevaluación;</w:t>
+        <w:t xml:space="preserve">en pygame con modos libre, historia, resistencia, escape room y feedback que gamifica la autoevaluación;</w:t>
       </w:r>
     </w:p>
     <w:p>
@@ -9561,11 +10622,11 @@
         <w:pStyle w:val="BodyText"/>
       </w:pPr>
       <w:r>
-        <w:t xml:space="preserve">La simulación Monte Carlo (§5.7) aporta una primera validación cuantitativa del motor de evaluación: el azar no permite aprobar ni completar partidas largas con vidas limitadas.</w:t>
-      </w:r>
-    </w:p>
-    <w:bookmarkEnd w:id="95"/>
-    <w:bookmarkStart w:id="104" w:name="bibliografía"/>
+        <w:t xml:space="preserve">La simulación Monte Carlo (§5.7) aporta una primera validación cuantitativa del motor de evaluación: el azar no permite aprobar ni completar partidas largas con vidas limitadas. El análisis del pity (§5.8) cuantifica cómo se acotan las rachas sin recompensas en escape room y resistencia.</w:t>
+      </w:r>
+    </w:p>
+    <w:bookmarkEnd w:id="108"/>
+    <w:bookmarkStart w:id="117" w:name="bibliografía"/>
     <w:p>
       <w:pPr>
         <w:pStyle w:val="Heading1"/>
@@ -9676,7 +10737,7 @@
       <w:r>
         <w:t xml:space="preserve"> </w:t>
       </w:r>
-      <w:hyperlink r:id="rId96">
+      <w:hyperlink r:id="rId109">
         <w:r>
           <w:rPr>
             <w:rStyle w:val="Hyperlink"/>
@@ -9721,7 +10782,7 @@
       <w:r>
         <w:t xml:space="preserve"> </w:t>
       </w:r>
-      <w:hyperlink r:id="rId97">
+      <w:hyperlink r:id="rId110">
         <w:r>
           <w:rPr>
             <w:rStyle w:val="Hyperlink"/>
@@ -9766,7 +10827,7 @@
       <w:r>
         <w:t xml:space="preserve"> </w:t>
       </w:r>
-      <w:hyperlink r:id="rId98">
+      <w:hyperlink r:id="rId111">
         <w:r>
           <w:rPr>
             <w:rStyle w:val="Hyperlink"/>
@@ -9811,7 +10872,7 @@
       <w:r>
         <w:t xml:space="preserve"> </w:t>
       </w:r>
-      <w:hyperlink r:id="rId99">
+      <w:hyperlink r:id="rId112">
         <w:r>
           <w:rPr>
             <w:rStyle w:val="Hyperlink"/>
@@ -9856,7 +10917,7 @@
       <w:r>
         <w:t xml:space="preserve"> </w:t>
       </w:r>
-      <w:hyperlink r:id="rId100">
+      <w:hyperlink r:id="rId113">
         <w:r>
           <w:rPr>
             <w:rStyle w:val="Hyperlink"/>
@@ -9922,7 +10983,7 @@
       <w:r>
         <w:t xml:space="preserve"> </w:t>
       </w:r>
-      <w:hyperlink r:id="rId101">
+      <w:hyperlink r:id="rId114">
         <w:r>
           <w:rPr>
             <w:rStyle w:val="Hyperlink"/>
@@ -9967,7 +11028,7 @@
       <w:r>
         <w:t xml:space="preserve"> </w:t>
       </w:r>
-      <w:hyperlink r:id="rId102">
+      <w:hyperlink r:id="rId115">
         <w:r>
           <w:rPr>
             <w:rStyle w:val="Hyperlink"/>
@@ -10012,7 +11073,7 @@
       <w:r>
         <w:t xml:space="preserve"> </w:t>
       </w:r>
-      <w:hyperlink r:id="rId103">
+      <w:hyperlink r:id="rId116">
         <w:r>
           <w:rPr>
             <w:rStyle w:val="Hyperlink"/>
@@ -10021,8 +11082,8 @@
         </w:r>
       </w:hyperlink>
     </w:p>
-    <w:bookmarkEnd w:id="104"/>
-    <w:bookmarkStart w:id="106" w:name="apéndices"/>
+    <w:bookmarkEnd w:id="117"/>
+    <w:bookmarkStart w:id="119" w:name="apéndices"/>
     <w:p>
       <w:pPr>
         <w:pStyle w:val="Heading1"/>
@@ -10454,7 +11515,7 @@
       <w:r>
         <w:t xml:space="preserve"> </w:t>
       </w:r>
-      <w:hyperlink r:id="rId105">
+      <w:hyperlink r:id="rId118">
         <w:r>
           <w:rPr>
             <w:rStyle w:val="Hyperlink"/>
@@ -10463,7 +11524,7 @@
         </w:r>
       </w:hyperlink>
     </w:p>
-    <w:bookmarkEnd w:id="106"/>
+    <w:bookmarkEnd w:id="119"/>
     <w:sectPr>
       <w:footnotePr>
         <w:numRestart w:val="eachSect"/>

</xml_diff>

<commit_message>
Cerrar v1.0.0: mecanicas de juego, limpieza obsoleta y documentacion alineada.
Version jugable para entrega TFG (v1.0.0, 578 tests). Incluye pity en resistencia, maldicion mortal en escape, fixes de apuestas/UI, eliminacion de codigo y textos legacy, RELEASE_1.0 y zips regenerados.

Co-authored-by: Cursor <cursoragent@cursor.com>
</commit_message>
<xml_diff>
--- a/Docs/Entrega/Memoria_TFG_latex.docx
+++ b/Docs/Entrega/Memoria_TFG_latex.docx
@@ -4440,7 +4440,7 @@
                 <w:b/>
                 <w:bCs/>
               </w:rPr>
-              <w:t xml:space="preserve">468</w:t>
+              <w:t xml:space="preserve">578</w:t>
             </w:r>
             <w:r>
               <w:t xml:space="preserve"> </w:t>
@@ -4906,7 +4906,7 @@
         <w:t xml:space="preserve"> </w:t>
       </w:r>
       <w:r>
-        <w:t xml:space="preserve">en CSV y plantillas intra-materia tras sustituciones y deduplicación (junio 2026). Pool de plantillas beta:</w:t>
+        <w:t xml:space="preserve">en CSV y plantillas intra-materia tras sustituciones y deduplicación (junio 2026). Pool del banco ampliado:</w:t>
       </w:r>
       <w:r>
         <w:t xml:space="preserve"> </w:t>
@@ -4940,29 +4940,29 @@
           <w:b/>
           <w:bCs/>
         </w:rPr>
-        <w:t xml:space="preserve">modo seguro</w:t>
-      </w:r>
-      <w:r>
-        <w:t xml:space="preserve"> </w:t>
-      </w:r>
-      <w:r>
-        <w:t xml:space="preserve">(solo dataset revisado) y</w:t>
-      </w:r>
-      <w:r>
-        <w:t xml:space="preserve"> </w:t>
-      </w:r>
-      <w:r>
-        <w:rPr>
-          <w:b/>
-          <w:bCs/>
-        </w:rPr>
-        <w:t xml:space="preserve">modo beta</w:t>
-      </w:r>
-      <w:r>
-        <w:t xml:space="preserve"> </w:t>
-      </w:r>
-      <w:r>
-        <w:t xml:space="preserve">(pool ampliado con plantillas no revisadas, hasta 1440 ítems jugables), dejando clara la trazabilidad para evaluación formal del TFG.</w:t>
+        <w:t xml:space="preserve">banco revisado</w:t>
+      </w:r>
+      <w:r>
+        <w:t xml:space="preserve"> </w:t>
+      </w:r>
+      <w:r>
+        <w:t xml:space="preserve">(solo dataset validado) y</w:t>
+      </w:r>
+      <w:r>
+        <w:t xml:space="preserve"> </w:t>
+      </w:r>
+      <w:r>
+        <w:rPr>
+          <w:b/>
+          <w:bCs/>
+        </w:rPr>
+        <w:t xml:space="preserve">banco ampliado</w:t>
+      </w:r>
+      <w:r>
+        <w:t xml:space="preserve"> </w:t>
+      </w:r>
+      <w:r>
+        <w:t xml:space="preserve">(pool con plantillas no revisadas, hasta 1440 ítems jugables), dejando clara la trazabilidad para evaluación formal del TFG.</w:t>
       </w:r>
     </w:p>
     <w:bookmarkEnd w:id="81"/>
@@ -5548,7 +5548,7 @@
                 <w:b/>
                 <w:bCs/>
               </w:rPr>
-              <w:t xml:space="preserve">468</w:t>
+              <w:t xml:space="preserve">578</w:t>
             </w:r>
             <w:r>
               <w:t xml:space="preserve"> </w:t>
@@ -6719,7 +6719,7 @@
           <w:b/>
           <w:bCs/>
         </w:rPr>
-        <w:t xml:space="preserve">468</w:t>
+        <w:t xml:space="preserve">578</w:t>
       </w:r>
       <w:r>
         <w:t xml:space="preserve"> </w:t>
@@ -6963,7 +6963,7 @@
               <w:jc w:val="left"/>
             </w:pPr>
             <w:r>
-              <w:t xml:space="preserve">468</w:t>
+              <w:t xml:space="preserve">578</w:t>
             </w:r>
           </w:p>
         </w:tc>
@@ -10815,7 +10815,7 @@
               <w:jc w:val="left"/>
             </w:pPr>
             <w:r>
-              <w:t xml:space="preserve">Banco validado, 468 tests + CI + simulaciones; sin estudio con usuarios</w:t>
+              <w:t xml:space="preserve">Banco validado, 578 tests + CI + simulaciones; sin estudio con usuarios</w:t>
             </w:r>
           </w:p>
         </w:tc>
@@ -11485,13 +11485,13 @@
           <w:b/>
           <w:bCs/>
         </w:rPr>
-        <w:t xml:space="preserve">modo beta</w:t>
-      </w:r>
-      <w:r>
-        <w:t xml:space="preserve"> </w:t>
-      </w:r>
-      <w:r>
-        <w:t xml:space="preserve">amplía el pool con plantillas no revisadas y debe distinguirse del banco de producción en cualquier evaluación formal.</w:t>
+        <w:t xml:space="preserve">banco ampliado</w:t>
+      </w:r>
+      <w:r>
+        <w:t xml:space="preserve"> </w:t>
+      </w:r>
+      <w:r>
+        <w:t xml:space="preserve">extiende el pool con plantillas no revisadas y debe distinguirse del banco de producción en cualquier evaluación formal.</w:t>
       </w:r>
     </w:p>
     <w:bookmarkEnd w:id="114"/>

</xml_diff>